<commit_message>
configuracion exitosa de nueva UI mas corta
</commit_message>
<xml_diff>
--- a/InstruccionesChatGpt_Word/InstruccionesChatGpt_Word_013_PaletasMasPastel.docx
+++ b/InstruccionesChatGpt_Word/InstruccionesChatGpt_Word_013_PaletasMasPastel.docx
@@ -6506,9 +6506,9 @@
         <w:tblLook w:val="04A0" w:firstRow="1" w:lastRow="0" w:firstColumn="1" w:lastColumn="0" w:noHBand="0" w:noVBand="1"/>
       </w:tblPr>
       <w:tblGrid>
-        <w:gridCol w:w="1838"/>
-        <w:gridCol w:w="5116"/>
-        <w:gridCol w:w="8072"/>
+        <w:gridCol w:w="1832"/>
+        <w:gridCol w:w="4509"/>
+        <w:gridCol w:w="8724"/>
       </w:tblGrid>
       <w:tr>
         <w:trPr>
@@ -6626,15 +6626,14 @@
               <w:tblLook w:val="04A0" w:firstRow="1" w:lastRow="0" w:firstColumn="1" w:lastColumn="0" w:noHBand="0" w:noVBand="1"/>
             </w:tblPr>
             <w:tblGrid>
-              <w:gridCol w:w="709"/>
-              <w:gridCol w:w="453"/>
-              <w:gridCol w:w="3018"/>
+              <w:gridCol w:w="553"/>
+              <w:gridCol w:w="3020"/>
             </w:tblGrid>
             <w:tr>
               <w:tc>
                 <w:tcPr>
                   <w:tcW w:w="4239" w:type="dxa"/>
-                  <w:gridSpan w:val="3"/>
+                  <w:gridSpan w:val="2"/>
                   <w:shd w:val="clear" w:color="auto" w:fill="F0F8DE" w:themeFill="accent3" w:themeFillTint="33"/>
                 </w:tcPr>
                 <w:p>
@@ -6660,7 +6659,7 @@
               <w:tc>
                 <w:tcPr>
                   <w:tcW w:w="4239" w:type="dxa"/>
-                  <w:gridSpan w:val="3"/>
+                  <w:gridSpan w:val="2"/>
                 </w:tcPr>
                 <w:p>
                   <w:pPr>
@@ -6766,7 +6765,6 @@
               <w:tc>
                 <w:tcPr>
                   <w:tcW w:w="3515" w:type="dxa"/>
-                  <w:gridSpan w:val="2"/>
                   <w:shd w:val="clear" w:color="auto" w:fill="F0F8DE" w:themeFill="accent3" w:themeFillTint="33"/>
                 </w:tcPr>
                 <w:p>
@@ -6792,7 +6790,6 @@
               <w:tc>
                 <w:tcPr>
                   <w:tcW w:w="1221" w:type="dxa"/>
-                  <w:gridSpan w:val="2"/>
                 </w:tcPr>
                 <w:p>
                   <w:pPr>
@@ -6909,7 +6906,6 @@
               <w:tc>
                 <w:tcPr>
                   <w:tcW w:w="1221" w:type="dxa"/>
-                  <w:gridSpan w:val="2"/>
                 </w:tcPr>
                 <w:p>
                   <w:pPr>
@@ -7026,7 +7022,6 @@
               <w:tc>
                 <w:tcPr>
                   <w:tcW w:w="1221" w:type="dxa"/>
-                  <w:gridSpan w:val="2"/>
                 </w:tcPr>
                 <w:p>
                   <w:pPr>
@@ -7143,7 +7138,6 @@
               <w:tc>
                 <w:tcPr>
                   <w:tcW w:w="1221" w:type="dxa"/>
-                  <w:gridSpan w:val="2"/>
                 </w:tcPr>
                 <w:p>
                   <w:pPr>
@@ -7268,7 +7262,6 @@
               <w:tc>
                 <w:tcPr>
                   <w:tcW w:w="1221" w:type="dxa"/>
-                  <w:gridSpan w:val="2"/>
                 </w:tcPr>
                 <w:p>
                   <w:pPr>
@@ -7388,7 +7381,6 @@
               <w:tc>
                 <w:tcPr>
                   <w:tcW w:w="1221" w:type="dxa"/>
-                  <w:gridSpan w:val="2"/>
                 </w:tcPr>
                 <w:p>
                   <w:pPr>
@@ -7508,7 +7500,6 @@
               <w:tc>
                 <w:tcPr>
                   <w:tcW w:w="1221" w:type="dxa"/>
-                  <w:gridSpan w:val="2"/>
                 </w:tcPr>
                 <w:p>
                   <w:pPr>
@@ -7628,7 +7619,6 @@
               <w:tc>
                 <w:tcPr>
                   <w:tcW w:w="1221" w:type="dxa"/>
-                  <w:gridSpan w:val="2"/>
                 </w:tcPr>
                 <w:p>
                   <w:pPr>
@@ -7752,7 +7742,6 @@
               <w:tc>
                 <w:tcPr>
                   <w:tcW w:w="3515" w:type="dxa"/>
-                  <w:gridSpan w:val="2"/>
                   <w:shd w:val="clear" w:color="auto" w:fill="F0F8DE" w:themeFill="accent3" w:themeFillTint="33"/>
                 </w:tcPr>
                 <w:p>
@@ -7778,7 +7767,6 @@
               <w:tc>
                 <w:tcPr>
                   <w:tcW w:w="1221" w:type="dxa"/>
-                  <w:gridSpan w:val="2"/>
                 </w:tcPr>
                 <w:p>
                   <w:pPr>
@@ -7898,7 +7886,6 @@
               <w:tc>
                 <w:tcPr>
                   <w:tcW w:w="1221" w:type="dxa"/>
-                  <w:gridSpan w:val="2"/>
                 </w:tcPr>
                 <w:p>
                   <w:pPr>
@@ -8018,7 +8005,6 @@
               <w:tc>
                 <w:tcPr>
                   <w:tcW w:w="1221" w:type="dxa"/>
-                  <w:gridSpan w:val="2"/>
                 </w:tcPr>
                 <w:p>
                   <w:pPr>
@@ -8138,7 +8124,6 @@
               <w:tc>
                 <w:tcPr>
                   <w:tcW w:w="1221" w:type="dxa"/>
-                  <w:gridSpan w:val="2"/>
                 </w:tcPr>
                 <w:p>
                   <w:pPr>
@@ -8258,7 +8243,6 @@
               <w:tc>
                 <w:tcPr>
                   <w:tcW w:w="1221" w:type="dxa"/>
-                  <w:gridSpan w:val="2"/>
                 </w:tcPr>
                 <w:p>
                   <w:pPr>
@@ -8378,7 +8362,6 @@
               <w:tc>
                 <w:tcPr>
                   <w:tcW w:w="1221" w:type="dxa"/>
-                  <w:gridSpan w:val="2"/>
                 </w:tcPr>
                 <w:p>
                   <w:pPr>
@@ -8987,16 +8970,18 @@
           <w:tbl>
             <w:tblPr>
               <w:tblStyle w:val="Tablaconcuadrcula"/>
-              <w:tblW w:w="0" w:type="auto"/>
+              <w:tblW w:w="8498" w:type="dxa"/>
               <w:tblLook w:val="04A0" w:firstRow="1" w:lastRow="0" w:firstColumn="1" w:lastColumn="0" w:noHBand="0" w:noVBand="1"/>
             </w:tblPr>
             <w:tblGrid>
-              <w:gridCol w:w="2137"/>
-              <w:gridCol w:w="1184"/>
+              <w:gridCol w:w="2136"/>
+              <w:gridCol w:w="1428"/>
               <w:gridCol w:w="631"/>
-              <w:gridCol w:w="2016"/>
-              <w:gridCol w:w="1210"/>
+              <w:gridCol w:w="6"/>
+              <w:gridCol w:w="2100"/>
+              <w:gridCol w:w="1516"/>
               <w:gridCol w:w="668"/>
+              <w:gridCol w:w="13"/>
             </w:tblGrid>
             <w:tr>
               <w:trPr>
@@ -9004,8 +8989,8 @@
               </w:trPr>
               <w:tc>
                 <w:tcPr>
-                  <w:tcW w:w="4253" w:type="dxa"/>
-                  <w:gridSpan w:val="3"/>
+                  <w:tcW w:w="4201" w:type="dxa"/>
+                  <w:gridSpan w:val="4"/>
                   <w:vAlign w:val="center"/>
                 </w:tcPr>
                 <w:p>
@@ -9031,8 +9016,8 @@
               </w:tc>
               <w:tc>
                 <w:tcPr>
-                  <w:tcW w:w="4246" w:type="dxa"/>
-                  <w:gridSpan w:val="3"/>
+                  <w:tcW w:w="4297" w:type="dxa"/>
+                  <w:gridSpan w:val="4"/>
                   <w:vAlign w:val="center"/>
                 </w:tcPr>
                 <w:p>
@@ -9052,18 +9037,20 @@
                       <w:sz w:val="32"/>
                       <w:szCs w:val="32"/>
                     </w:rPr>
-                    <w:t>Fantasía</w:t>
+                    <w:t>Feo</w:t>
                   </w:r>
                 </w:p>
               </w:tc>
             </w:tr>
             <w:tr>
               <w:trPr>
+                <w:gridAfter w:val="1"/>
+                <w:wAfter w:w="13" w:type="dxa"/>
                 <w:trHeight w:val="798"/>
               </w:trPr>
               <w:tc>
                 <w:tcPr>
-                  <w:tcW w:w="2127" w:type="dxa"/>
+                  <w:tcW w:w="2136" w:type="dxa"/>
                   <w:vMerge w:val="restart"/>
                 </w:tcPr>
                 <w:p>
@@ -9122,45 +9109,45 @@
               </w:tc>
               <w:tc>
                 <w:tcPr>
-                  <w:tcW w:w="1275" w:type="dxa"/>
+                  <w:tcW w:w="1428" w:type="dxa"/>
                 </w:tcPr>
                 <w:p>
                   <w:pPr>
                     <w:jc w:val="both"/>
                     <w:rPr>
                       <w:color w:val="000000" w:themeColor="text1"/>
-                      <w:sz w:val="22"/>
-                      <w:szCs w:val="22"/>
+                      <w:sz w:val="16"/>
+                      <w:szCs w:val="16"/>
                     </w:rPr>
                   </w:pPr>
                   <w:r>
                     <w:rPr>
                       <w:color w:val="000000" w:themeColor="text1"/>
-                      <w:sz w:val="22"/>
-                      <w:szCs w:val="22"/>
-                    </w:rPr>
-                    <w:t xml:space="preserve">#ffff01 </w:t>
+                      <w:sz w:val="16"/>
+                      <w:szCs w:val="16"/>
+                    </w:rPr>
+                    <w:t>(4, 74, 198)</w:t>
                   </w:r>
                 </w:p>
               </w:tc>
               <w:tc>
                 <w:tcPr>
-                  <w:tcW w:w="851" w:type="dxa"/>
+                  <w:tcW w:w="631" w:type="dxa"/>
                 </w:tcPr>
                 <w:p>
                   <w:pPr>
                     <w:jc w:val="both"/>
                     <w:rPr>
                       <w:color w:val="000000" w:themeColor="text1"/>
-                      <w:sz w:val="22"/>
-                      <w:szCs w:val="22"/>
+                      <w:sz w:val="16"/>
+                      <w:szCs w:val="16"/>
                     </w:rPr>
                   </w:pPr>
                   <w:r>
                     <w:rPr>
                       <w:color w:val="000000" w:themeColor="text1"/>
-                      <w:sz w:val="22"/>
-                      <w:szCs w:val="22"/>
+                      <w:sz w:val="16"/>
+                      <w:szCs w:val="16"/>
                     </w:rPr>
                     <w:t>35%</w:t>
                   </w:r>
@@ -9168,7 +9155,8 @@
               </w:tc>
               <w:tc>
                 <w:tcPr>
-                  <w:tcW w:w="1984" w:type="dxa"/>
+                  <w:tcW w:w="2106" w:type="dxa"/>
+                  <w:gridSpan w:val="2"/>
                   <w:vMerge w:val="restart"/>
                 </w:tcPr>
                 <w:p>
@@ -9188,7 +9176,908 @@
                       <w:szCs w:val="24"/>
                     </w:rPr>
                     <w:drawing>
-                      <wp:inline distT="0" distB="0" distL="0" distR="0" wp14:anchorId="664A3D31" wp14:editId="491A7264">
+                      <wp:inline distT="0" distB="0" distL="0" distR="0" wp14:anchorId="0CFAFAC0" wp14:editId="13725ABD">
+                        <wp:extent cx="1109663" cy="1581646"/>
+                        <wp:effectExtent l="0" t="0" r="0" b="0"/>
+                        <wp:docPr id="50" name="Imagen 50"/>
+                        <wp:cNvGraphicFramePr>
+                          <a:graphicFrameLocks xmlns:a="http://schemas.openxmlformats.org/drawingml/2006/main" noChangeAspect="1"/>
+                        </wp:cNvGraphicFramePr>
+                        <a:graphic xmlns:a="http://schemas.openxmlformats.org/drawingml/2006/main">
+                          <a:graphicData uri="http://schemas.openxmlformats.org/drawingml/2006/picture">
+                            <pic:pic xmlns:pic="http://schemas.openxmlformats.org/drawingml/2006/picture">
+                              <pic:nvPicPr>
+                                <pic:cNvPr id="1" name=""/>
+                                <pic:cNvPicPr/>
+                              </pic:nvPicPr>
+                              <pic:blipFill>
+                                <a:blip r:embed="rId44"/>
+                                <a:stretch>
+                                  <a:fillRect/>
+                                </a:stretch>
+                              </pic:blipFill>
+                              <pic:spPr>
+                                <a:xfrm>
+                                  <a:off x="0" y="0"/>
+                                  <a:ext cx="1115016" cy="1589276"/>
+                                </a:xfrm>
+                                <a:prstGeom prst="rect">
+                                  <a:avLst/>
+                                </a:prstGeom>
+                              </pic:spPr>
+                            </pic:pic>
+                          </a:graphicData>
+                        </a:graphic>
+                      </wp:inline>
+                    </w:drawing>
+                  </w:r>
+                </w:p>
+              </w:tc>
+              <w:tc>
+                <w:tcPr>
+                  <w:tcW w:w="1516" w:type="dxa"/>
+                </w:tcPr>
+                <w:p>
+                  <w:pPr>
+                    <w:jc w:val="both"/>
+                    <w:rPr>
+                      <w:color w:val="000000" w:themeColor="text1"/>
+                      <w:sz w:val="16"/>
+                      <w:szCs w:val="16"/>
+                    </w:rPr>
+                  </w:pPr>
+                  <w:r>
+                    <w:rPr>
+                      <w:color w:val="000000" w:themeColor="text1"/>
+                      <w:sz w:val="16"/>
+                      <w:szCs w:val="16"/>
+                    </w:rPr>
+                    <w:t>(101, 44, 0)</w:t>
+                  </w:r>
+                </w:p>
+              </w:tc>
+              <w:tc>
+                <w:tcPr>
+                  <w:tcW w:w="668" w:type="dxa"/>
+                </w:tcPr>
+                <w:p>
+                  <w:pPr>
+                    <w:jc w:val="both"/>
+                    <w:rPr>
+                      <w:color w:val="000000" w:themeColor="text1"/>
+                      <w:sz w:val="16"/>
+                      <w:szCs w:val="16"/>
+                    </w:rPr>
+                  </w:pPr>
+                  <w:r>
+                    <w:rPr>
+                      <w:color w:val="000000" w:themeColor="text1"/>
+                      <w:sz w:val="16"/>
+                      <w:szCs w:val="16"/>
+                    </w:rPr>
+                    <w:t>32%</w:t>
+                  </w:r>
+                </w:p>
+              </w:tc>
+            </w:tr>
+            <w:tr>
+              <w:trPr>
+                <w:gridAfter w:val="1"/>
+                <w:wAfter w:w="13" w:type="dxa"/>
+                <w:trHeight w:val="607"/>
+              </w:trPr>
+              <w:tc>
+                <w:tcPr>
+                  <w:tcW w:w="2136" w:type="dxa"/>
+                  <w:vMerge/>
+                </w:tcPr>
+                <w:p>
+                  <w:pPr>
+                    <w:jc w:val="both"/>
+                    <w:rPr>
+                      <w:color w:val="000000" w:themeColor="text1"/>
+                      <w:sz w:val="24"/>
+                      <w:szCs w:val="24"/>
+                    </w:rPr>
+                  </w:pPr>
+                </w:p>
+              </w:tc>
+              <w:tc>
+                <w:tcPr>
+                  <w:tcW w:w="1428" w:type="dxa"/>
+                  <w:vMerge w:val="restart"/>
+                </w:tcPr>
+                <w:p>
+                  <w:pPr>
+                    <w:jc w:val="both"/>
+                    <w:rPr>
+                      <w:color w:val="000000" w:themeColor="text1"/>
+                      <w:sz w:val="16"/>
+                      <w:szCs w:val="16"/>
+                    </w:rPr>
+                  </w:pPr>
+                  <w:r>
+                    <w:rPr>
+                      <w:color w:val="000000" w:themeColor="text1"/>
+                      <w:sz w:val="16"/>
+                      <w:szCs w:val="16"/>
+                    </w:rPr>
+                    <w:t>(94, 167, 0)</w:t>
+                  </w:r>
+                </w:p>
+              </w:tc>
+              <w:tc>
+                <w:tcPr>
+                  <w:tcW w:w="631" w:type="dxa"/>
+                  <w:vMerge w:val="restart"/>
+                </w:tcPr>
+                <w:p>
+                  <w:pPr>
+                    <w:jc w:val="both"/>
+                    <w:rPr>
+                      <w:color w:val="000000" w:themeColor="text1"/>
+                      <w:sz w:val="16"/>
+                      <w:szCs w:val="16"/>
+                    </w:rPr>
+                  </w:pPr>
+                  <w:r>
+                    <w:rPr>
+                      <w:color w:val="000000" w:themeColor="text1"/>
+                      <w:sz w:val="16"/>
+                      <w:szCs w:val="16"/>
+                    </w:rPr>
+                    <w:t>35%</w:t>
+                  </w:r>
+                </w:p>
+              </w:tc>
+              <w:tc>
+                <w:tcPr>
+                  <w:tcW w:w="2106" w:type="dxa"/>
+                  <w:gridSpan w:val="2"/>
+                  <w:vMerge/>
+                </w:tcPr>
+                <w:p>
+                  <w:pPr>
+                    <w:jc w:val="both"/>
+                    <w:rPr>
+                      <w:color w:val="000000" w:themeColor="text1"/>
+                      <w:sz w:val="24"/>
+                      <w:szCs w:val="24"/>
+                    </w:rPr>
+                  </w:pPr>
+                </w:p>
+              </w:tc>
+              <w:tc>
+                <w:tcPr>
+                  <w:tcW w:w="1516" w:type="dxa"/>
+                </w:tcPr>
+                <w:p>
+                  <w:pPr>
+                    <w:jc w:val="both"/>
+                    <w:rPr>
+                      <w:color w:val="000000" w:themeColor="text1"/>
+                      <w:sz w:val="16"/>
+                      <w:szCs w:val="16"/>
+                    </w:rPr>
+                  </w:pPr>
+                  <w:r>
+                    <w:rPr>
+                      <w:color w:val="000000" w:themeColor="text1"/>
+                      <w:sz w:val="16"/>
+                      <w:szCs w:val="16"/>
+                    </w:rPr>
+                    <w:t>(89, 101, 97)</w:t>
+                  </w:r>
+                </w:p>
+              </w:tc>
+              <w:tc>
+                <w:tcPr>
+                  <w:tcW w:w="668" w:type="dxa"/>
+                </w:tcPr>
+                <w:p>
+                  <w:pPr>
+                    <w:jc w:val="both"/>
+                    <w:rPr>
+                      <w:color w:val="000000" w:themeColor="text1"/>
+                      <w:sz w:val="16"/>
+                      <w:szCs w:val="16"/>
+                    </w:rPr>
+                  </w:pPr>
+                  <w:r>
+                    <w:rPr>
+                      <w:color w:val="000000" w:themeColor="text1"/>
+                      <w:sz w:val="16"/>
+                      <w:szCs w:val="16"/>
+                    </w:rPr>
+                    <w:t>32%</w:t>
+                  </w:r>
+                </w:p>
+              </w:tc>
+            </w:tr>
+            <w:tr>
+              <w:trPr>
+                <w:gridAfter w:val="1"/>
+                <w:wAfter w:w="13" w:type="dxa"/>
+                <w:trHeight w:val="294"/>
+              </w:trPr>
+              <w:tc>
+                <w:tcPr>
+                  <w:tcW w:w="2136" w:type="dxa"/>
+                  <w:vMerge/>
+                </w:tcPr>
+                <w:p>
+                  <w:pPr>
+                    <w:jc w:val="both"/>
+                    <w:rPr>
+                      <w:color w:val="000000" w:themeColor="text1"/>
+                      <w:sz w:val="24"/>
+                      <w:szCs w:val="24"/>
+                    </w:rPr>
+                  </w:pPr>
+                </w:p>
+              </w:tc>
+              <w:tc>
+                <w:tcPr>
+                  <w:tcW w:w="1428" w:type="dxa"/>
+                  <w:vMerge/>
+                </w:tcPr>
+                <w:p>
+                  <w:pPr>
+                    <w:jc w:val="both"/>
+                    <w:rPr>
+                      <w:color w:val="000000" w:themeColor="text1"/>
+                      <w:sz w:val="16"/>
+                      <w:szCs w:val="16"/>
+                    </w:rPr>
+                  </w:pPr>
+                </w:p>
+              </w:tc>
+              <w:tc>
+                <w:tcPr>
+                  <w:tcW w:w="631" w:type="dxa"/>
+                  <w:vMerge/>
+                </w:tcPr>
+                <w:p>
+                  <w:pPr>
+                    <w:jc w:val="both"/>
+                    <w:rPr>
+                      <w:color w:val="000000" w:themeColor="text1"/>
+                      <w:sz w:val="16"/>
+                      <w:szCs w:val="16"/>
+                    </w:rPr>
+                  </w:pPr>
+                </w:p>
+              </w:tc>
+              <w:tc>
+                <w:tcPr>
+                  <w:tcW w:w="2106" w:type="dxa"/>
+                  <w:gridSpan w:val="2"/>
+                  <w:vMerge/>
+                </w:tcPr>
+                <w:p>
+                  <w:pPr>
+                    <w:jc w:val="both"/>
+                    <w:rPr>
+                      <w:color w:val="000000" w:themeColor="text1"/>
+                      <w:sz w:val="24"/>
+                      <w:szCs w:val="24"/>
+                    </w:rPr>
+                  </w:pPr>
+                </w:p>
+              </w:tc>
+              <w:tc>
+                <w:tcPr>
+                  <w:tcW w:w="1516" w:type="dxa"/>
+                  <w:vMerge w:val="restart"/>
+                </w:tcPr>
+                <w:p>
+                  <w:pPr>
+                    <w:jc w:val="both"/>
+                    <w:rPr>
+                      <w:color w:val="000000" w:themeColor="text1"/>
+                      <w:sz w:val="16"/>
+                      <w:szCs w:val="16"/>
+                    </w:rPr>
+                  </w:pPr>
+                  <w:r>
+                    <w:rPr>
+                      <w:color w:val="000000" w:themeColor="text1"/>
+                      <w:sz w:val="16"/>
+                      <w:szCs w:val="16"/>
+                    </w:rPr>
+                    <w:t>(0, 0, 0)</w:t>
+                  </w:r>
+                </w:p>
+              </w:tc>
+              <w:tc>
+                <w:tcPr>
+                  <w:tcW w:w="668" w:type="dxa"/>
+                  <w:vMerge w:val="restart"/>
+                </w:tcPr>
+                <w:p>
+                  <w:pPr>
+                    <w:jc w:val="both"/>
+                    <w:rPr>
+                      <w:color w:val="000000" w:themeColor="text1"/>
+                      <w:sz w:val="16"/>
+                      <w:szCs w:val="16"/>
+                    </w:rPr>
+                  </w:pPr>
+                  <w:r>
+                    <w:rPr>
+                      <w:color w:val="000000" w:themeColor="text1"/>
+                      <w:sz w:val="16"/>
+                      <w:szCs w:val="16"/>
+                    </w:rPr>
+                    <w:t>26%</w:t>
+                  </w:r>
+                </w:p>
+              </w:tc>
+            </w:tr>
+            <w:tr>
+              <w:trPr>
+                <w:gridAfter w:val="1"/>
+                <w:wAfter w:w="13" w:type="dxa"/>
+                <w:trHeight w:val="294"/>
+              </w:trPr>
+              <w:tc>
+                <w:tcPr>
+                  <w:tcW w:w="2136" w:type="dxa"/>
+                  <w:vMerge/>
+                </w:tcPr>
+                <w:p>
+                  <w:pPr>
+                    <w:jc w:val="both"/>
+                    <w:rPr>
+                      <w:color w:val="000000" w:themeColor="text1"/>
+                      <w:sz w:val="24"/>
+                      <w:szCs w:val="24"/>
+                    </w:rPr>
+                  </w:pPr>
+                </w:p>
+              </w:tc>
+              <w:tc>
+                <w:tcPr>
+                  <w:tcW w:w="1428" w:type="dxa"/>
+                  <w:vMerge w:val="restart"/>
+                </w:tcPr>
+                <w:p>
+                  <w:pPr>
+                    <w:jc w:val="both"/>
+                    <w:rPr>
+                      <w:color w:val="000000" w:themeColor="text1"/>
+                      <w:sz w:val="16"/>
+                      <w:szCs w:val="16"/>
+                    </w:rPr>
+                  </w:pPr>
+                  <w:r>
+                    <w:rPr>
+                      <w:color w:val="000000" w:themeColor="text1"/>
+                      <w:sz w:val="16"/>
+                      <w:szCs w:val="16"/>
+                    </w:rPr>
+                    <w:t>(255, 255, 255)</w:t>
+                  </w:r>
+                </w:p>
+              </w:tc>
+              <w:tc>
+                <w:tcPr>
+                  <w:tcW w:w="631" w:type="dxa"/>
+                  <w:vMerge w:val="restart"/>
+                </w:tcPr>
+                <w:p>
+                  <w:pPr>
+                    <w:jc w:val="both"/>
+                    <w:rPr>
+                      <w:color w:val="000000" w:themeColor="text1"/>
+                      <w:sz w:val="16"/>
+                      <w:szCs w:val="16"/>
+                    </w:rPr>
+                  </w:pPr>
+                  <w:r>
+                    <w:rPr>
+                      <w:color w:val="000000" w:themeColor="text1"/>
+                      <w:sz w:val="16"/>
+                      <w:szCs w:val="16"/>
+                    </w:rPr>
+                    <w:t>15%</w:t>
+                  </w:r>
+                </w:p>
+              </w:tc>
+              <w:tc>
+                <w:tcPr>
+                  <w:tcW w:w="2106" w:type="dxa"/>
+                  <w:gridSpan w:val="2"/>
+                  <w:vMerge/>
+                </w:tcPr>
+                <w:p>
+                  <w:pPr>
+                    <w:jc w:val="both"/>
+                    <w:rPr>
+                      <w:color w:val="000000" w:themeColor="text1"/>
+                      <w:sz w:val="24"/>
+                      <w:szCs w:val="24"/>
+                    </w:rPr>
+                  </w:pPr>
+                </w:p>
+              </w:tc>
+              <w:tc>
+                <w:tcPr>
+                  <w:tcW w:w="1516" w:type="dxa"/>
+                  <w:vMerge/>
+                </w:tcPr>
+                <w:p>
+                  <w:pPr>
+                    <w:jc w:val="both"/>
+                    <w:rPr>
+                      <w:color w:val="000000" w:themeColor="text1"/>
+                      <w:sz w:val="16"/>
+                      <w:szCs w:val="16"/>
+                    </w:rPr>
+                  </w:pPr>
+                </w:p>
+              </w:tc>
+              <w:tc>
+                <w:tcPr>
+                  <w:tcW w:w="668" w:type="dxa"/>
+                  <w:vMerge/>
+                </w:tcPr>
+                <w:p>
+                  <w:pPr>
+                    <w:jc w:val="both"/>
+                    <w:rPr>
+                      <w:color w:val="000000" w:themeColor="text1"/>
+                      <w:sz w:val="16"/>
+                      <w:szCs w:val="16"/>
+                    </w:rPr>
+                  </w:pPr>
+                </w:p>
+              </w:tc>
+            </w:tr>
+            <w:tr>
+              <w:trPr>
+                <w:gridAfter w:val="1"/>
+                <w:wAfter w:w="13" w:type="dxa"/>
+                <w:trHeight w:val="294"/>
+              </w:trPr>
+              <w:tc>
+                <w:tcPr>
+                  <w:tcW w:w="2136" w:type="dxa"/>
+                  <w:vMerge/>
+                </w:tcPr>
+                <w:p>
+                  <w:pPr>
+                    <w:jc w:val="both"/>
+                    <w:rPr>
+                      <w:color w:val="000000" w:themeColor="text1"/>
+                      <w:sz w:val="24"/>
+                      <w:szCs w:val="24"/>
+                    </w:rPr>
+                  </w:pPr>
+                </w:p>
+              </w:tc>
+              <w:tc>
+                <w:tcPr>
+                  <w:tcW w:w="1428" w:type="dxa"/>
+                  <w:vMerge/>
+                </w:tcPr>
+                <w:p>
+                  <w:pPr>
+                    <w:jc w:val="both"/>
+                    <w:rPr>
+                      <w:color w:val="000000" w:themeColor="text1"/>
+                      <w:sz w:val="16"/>
+                      <w:szCs w:val="16"/>
+                    </w:rPr>
+                  </w:pPr>
+                </w:p>
+              </w:tc>
+              <w:tc>
+                <w:tcPr>
+                  <w:tcW w:w="631" w:type="dxa"/>
+                  <w:vMerge/>
+                </w:tcPr>
+                <w:p>
+                  <w:pPr>
+                    <w:jc w:val="both"/>
+                    <w:rPr>
+                      <w:color w:val="000000" w:themeColor="text1"/>
+                      <w:sz w:val="16"/>
+                      <w:szCs w:val="16"/>
+                    </w:rPr>
+                  </w:pPr>
+                </w:p>
+              </w:tc>
+              <w:tc>
+                <w:tcPr>
+                  <w:tcW w:w="2106" w:type="dxa"/>
+                  <w:gridSpan w:val="2"/>
+                  <w:vMerge/>
+                </w:tcPr>
+                <w:p>
+                  <w:pPr>
+                    <w:jc w:val="both"/>
+                    <w:rPr>
+                      <w:color w:val="000000" w:themeColor="text1"/>
+                      <w:sz w:val="24"/>
+                      <w:szCs w:val="24"/>
+                    </w:rPr>
+                  </w:pPr>
+                </w:p>
+              </w:tc>
+              <w:tc>
+                <w:tcPr>
+                  <w:tcW w:w="1516" w:type="dxa"/>
+                  <w:vMerge w:val="restart"/>
+                </w:tcPr>
+                <w:p>
+                  <w:pPr>
+                    <w:jc w:val="both"/>
+                    <w:rPr>
+                      <w:color w:val="000000" w:themeColor="text1"/>
+                      <w:sz w:val="16"/>
+                      <w:szCs w:val="16"/>
+                    </w:rPr>
+                  </w:pPr>
+                  <w:r>
+                    <w:rPr>
+                      <w:color w:val="000000" w:themeColor="text1"/>
+                      <w:sz w:val="16"/>
+                      <w:szCs w:val="16"/>
+                    </w:rPr>
+                    <w:t>(9, 16, 124)</w:t>
+                  </w:r>
+                </w:p>
+              </w:tc>
+              <w:tc>
+                <w:tcPr>
+                  <w:tcW w:w="668" w:type="dxa"/>
+                  <w:vMerge w:val="restart"/>
+                </w:tcPr>
+                <w:p>
+                  <w:pPr>
+                    <w:jc w:val="both"/>
+                    <w:rPr>
+                      <w:color w:val="000000" w:themeColor="text1"/>
+                      <w:sz w:val="16"/>
+                      <w:szCs w:val="16"/>
+                    </w:rPr>
+                  </w:pPr>
+                  <w:r>
+                    <w:rPr>
+                      <w:color w:val="000000" w:themeColor="text1"/>
+                      <w:sz w:val="16"/>
+                      <w:szCs w:val="16"/>
+                    </w:rPr>
+                    <w:t>10%</w:t>
+                  </w:r>
+                </w:p>
+              </w:tc>
+            </w:tr>
+            <w:tr>
+              <w:trPr>
+                <w:gridAfter w:val="1"/>
+                <w:wAfter w:w="13" w:type="dxa"/>
+                <w:trHeight w:val="61"/>
+              </w:trPr>
+              <w:tc>
+                <w:tcPr>
+                  <w:tcW w:w="2136" w:type="dxa"/>
+                  <w:vMerge/>
+                </w:tcPr>
+                <w:p>
+                  <w:pPr>
+                    <w:jc w:val="both"/>
+                    <w:rPr>
+                      <w:color w:val="000000" w:themeColor="text1"/>
+                      <w:sz w:val="24"/>
+                      <w:szCs w:val="24"/>
+                    </w:rPr>
+                  </w:pPr>
+                </w:p>
+              </w:tc>
+              <w:tc>
+                <w:tcPr>
+                  <w:tcW w:w="1428" w:type="dxa"/>
+                </w:tcPr>
+                <w:p>
+                  <w:pPr>
+                    <w:jc w:val="both"/>
+                    <w:rPr>
+                      <w:color w:val="000000" w:themeColor="text1"/>
+                      <w:sz w:val="16"/>
+                      <w:szCs w:val="16"/>
+                    </w:rPr>
+                  </w:pPr>
+                  <w:r>
+                    <w:rPr>
+                      <w:color w:val="000000" w:themeColor="text1"/>
+                      <w:sz w:val="16"/>
+                      <w:szCs w:val="16"/>
+                    </w:rPr>
+                    <w:t>(255, 255, 1)</w:t>
+                  </w:r>
+                </w:p>
+              </w:tc>
+              <w:tc>
+                <w:tcPr>
+                  <w:tcW w:w="631" w:type="dxa"/>
+                </w:tcPr>
+                <w:p>
+                  <w:pPr>
+                    <w:jc w:val="both"/>
+                    <w:rPr>
+                      <w:color w:val="000000" w:themeColor="text1"/>
+                      <w:sz w:val="16"/>
+                      <w:szCs w:val="16"/>
+                    </w:rPr>
+                  </w:pPr>
+                  <w:r>
+                    <w:rPr>
+                      <w:color w:val="000000" w:themeColor="text1"/>
+                      <w:sz w:val="16"/>
+                      <w:szCs w:val="16"/>
+                    </w:rPr>
+                    <w:t>15%</w:t>
+                  </w:r>
+                </w:p>
+              </w:tc>
+              <w:tc>
+                <w:tcPr>
+                  <w:tcW w:w="2106" w:type="dxa"/>
+                  <w:gridSpan w:val="2"/>
+                  <w:vMerge/>
+                </w:tcPr>
+                <w:p>
+                  <w:pPr>
+                    <w:jc w:val="both"/>
+                    <w:rPr>
+                      <w:color w:val="000000" w:themeColor="text1"/>
+                      <w:sz w:val="24"/>
+                      <w:szCs w:val="24"/>
+                    </w:rPr>
+                  </w:pPr>
+                </w:p>
+              </w:tc>
+              <w:tc>
+                <w:tcPr>
+                  <w:tcW w:w="1516" w:type="dxa"/>
+                  <w:vMerge/>
+                </w:tcPr>
+                <w:p>
+                  <w:pPr>
+                    <w:jc w:val="both"/>
+                    <w:rPr>
+                      <w:color w:val="000000" w:themeColor="text1"/>
+                      <w:sz w:val="24"/>
+                      <w:szCs w:val="24"/>
+                    </w:rPr>
+                  </w:pPr>
+                </w:p>
+              </w:tc>
+              <w:tc>
+                <w:tcPr>
+                  <w:tcW w:w="668" w:type="dxa"/>
+                  <w:vMerge/>
+                </w:tcPr>
+                <w:p>
+                  <w:pPr>
+                    <w:jc w:val="both"/>
+                    <w:rPr>
+                      <w:color w:val="000000" w:themeColor="text1"/>
+                      <w:sz w:val="24"/>
+                      <w:szCs w:val="24"/>
+                    </w:rPr>
+                  </w:pPr>
+                </w:p>
+              </w:tc>
+            </w:tr>
+            <w:tr>
+              <w:tc>
+                <w:tcPr>
+                  <w:tcW w:w="8498" w:type="dxa"/>
+                  <w:gridSpan w:val="8"/>
+                </w:tcPr>
+                <w:p>
+                  <w:pPr>
+                    <w:jc w:val="both"/>
+                    <w:rPr>
+                      <w:color w:val="000000" w:themeColor="text1"/>
+                      <w:sz w:val="24"/>
+                      <w:szCs w:val="24"/>
+                    </w:rPr>
+                  </w:pPr>
+                </w:p>
+              </w:tc>
+            </w:tr>
+            <w:tr>
+              <w:tc>
+                <w:tcPr>
+                  <w:tcW w:w="4201" w:type="dxa"/>
+                  <w:gridSpan w:val="4"/>
+                  <w:vAlign w:val="center"/>
+                </w:tcPr>
+                <w:p>
+                  <w:pPr>
+                    <w:jc w:val="center"/>
+                    <w:rPr>
+                      <w:color w:val="000000" w:themeColor="text1"/>
+                      <w:sz w:val="24"/>
+                      <w:szCs w:val="24"/>
+                    </w:rPr>
+                  </w:pPr>
+                  <w:r>
+                    <w:rPr>
+                      <w:b/>
+                      <w:bCs/>
+                      <w:sz w:val="32"/>
+                      <w:szCs w:val="32"/>
+                    </w:rPr>
+                    <w:t>Pequeño</w:t>
+                  </w:r>
+                </w:p>
+              </w:tc>
+              <w:tc>
+                <w:tcPr>
+                  <w:tcW w:w="4297" w:type="dxa"/>
+                  <w:gridSpan w:val="4"/>
+                  <w:vAlign w:val="center"/>
+                </w:tcPr>
+                <w:p>
+                  <w:pPr>
+                    <w:jc w:val="center"/>
+                    <w:rPr>
+                      <w:color w:val="000000" w:themeColor="text1"/>
+                      <w:sz w:val="24"/>
+                      <w:szCs w:val="24"/>
+                    </w:rPr>
+                  </w:pPr>
+                  <w:r>
+                    <w:rPr>
+                      <w:b/>
+                      <w:bCs/>
+                      <w:sz w:val="32"/>
+                      <w:szCs w:val="32"/>
+                    </w:rPr>
+                    <w:t>Fantasía</w:t>
+                  </w:r>
+                </w:p>
+              </w:tc>
+            </w:tr>
+            <w:tr>
+              <w:trPr>
+                <w:gridAfter w:val="1"/>
+                <w:wAfter w:w="13" w:type="dxa"/>
+                <w:trHeight w:val="798"/>
+              </w:trPr>
+              <w:tc>
+                <w:tcPr>
+                  <w:tcW w:w="2136" w:type="dxa"/>
+                  <w:vMerge w:val="restart"/>
+                </w:tcPr>
+                <w:p>
+                  <w:pPr>
+                    <w:jc w:val="both"/>
+                    <w:rPr>
+                      <w:color w:val="000000" w:themeColor="text1"/>
+                      <w:sz w:val="24"/>
+                      <w:szCs w:val="24"/>
+                    </w:rPr>
+                  </w:pPr>
+                  <w:r>
+                    <w:rPr>
+                      <w:color w:val="000000" w:themeColor="text1"/>
+                      <w:sz w:val="24"/>
+                      <w:szCs w:val="24"/>
+                    </w:rPr>
+                    <w:drawing>
+                      <wp:inline distT="0" distB="0" distL="0" distR="0" wp14:anchorId="2F495C8B" wp14:editId="2C701FF5">
+                        <wp:extent cx="1209684" cy="1390660"/>
+                        <wp:effectExtent l="0" t="0" r="9525" b="0"/>
+                        <wp:docPr id="8" name="Imagen 8"/>
+                        <wp:cNvGraphicFramePr>
+                          <a:graphicFrameLocks xmlns:a="http://schemas.openxmlformats.org/drawingml/2006/main" noChangeAspect="1"/>
+                        </wp:cNvGraphicFramePr>
+                        <a:graphic xmlns:a="http://schemas.openxmlformats.org/drawingml/2006/main">
+                          <a:graphicData uri="http://schemas.openxmlformats.org/drawingml/2006/picture">
+                            <pic:pic xmlns:pic="http://schemas.openxmlformats.org/drawingml/2006/picture">
+                              <pic:nvPicPr>
+                                <pic:cNvPr id="1" name=""/>
+                                <pic:cNvPicPr/>
+                              </pic:nvPicPr>
+                              <pic:blipFill>
+                                <a:blip r:embed="rId45"/>
+                                <a:stretch>
+                                  <a:fillRect/>
+                                </a:stretch>
+                              </pic:blipFill>
+                              <pic:spPr>
+                                <a:xfrm>
+                                  <a:off x="0" y="0"/>
+                                  <a:ext cx="1209684" cy="1390660"/>
+                                </a:xfrm>
+                                <a:prstGeom prst="rect">
+                                  <a:avLst/>
+                                </a:prstGeom>
+                              </pic:spPr>
+                            </pic:pic>
+                          </a:graphicData>
+                        </a:graphic>
+                      </wp:inline>
+                    </w:drawing>
+                  </w:r>
+                </w:p>
+              </w:tc>
+              <w:tc>
+                <w:tcPr>
+                  <w:tcW w:w="1428" w:type="dxa"/>
+                </w:tcPr>
+                <w:p>
+                  <w:pPr>
+                    <w:jc w:val="both"/>
+                    <w:rPr>
+                      <w:color w:val="000000" w:themeColor="text1"/>
+                      <w:sz w:val="18"/>
+                      <w:szCs w:val="18"/>
+                    </w:rPr>
+                  </w:pPr>
+                  <w:r>
+                    <w:rPr>
+                      <w:color w:val="000000" w:themeColor="text1"/>
+                      <w:sz w:val="18"/>
+                      <w:szCs w:val="18"/>
+                    </w:rPr>
+                    <w:t>(254, 180, 217)</w:t>
+                  </w:r>
+                </w:p>
+              </w:tc>
+              <w:tc>
+                <w:tcPr>
+                  <w:tcW w:w="631" w:type="dxa"/>
+                </w:tcPr>
+                <w:p>
+                  <w:pPr>
+                    <w:jc w:val="both"/>
+                    <w:rPr>
+                      <w:color w:val="000000" w:themeColor="text1"/>
+                      <w:sz w:val="18"/>
+                      <w:szCs w:val="18"/>
+                    </w:rPr>
+                  </w:pPr>
+                  <w:r>
+                    <w:rPr>
+                      <w:color w:val="000000" w:themeColor="text1"/>
+                      <w:sz w:val="18"/>
+                      <w:szCs w:val="18"/>
+                    </w:rPr>
+                    <w:t>40%</w:t>
+                  </w:r>
+                </w:p>
+              </w:tc>
+              <w:tc>
+                <w:tcPr>
+                  <w:tcW w:w="2106" w:type="dxa"/>
+                  <w:gridSpan w:val="2"/>
+                  <w:vMerge w:val="restart"/>
+                </w:tcPr>
+                <w:p>
+                  <w:pPr>
+                    <w:jc w:val="both"/>
+                    <w:rPr>
+                      <w:color w:val="000000" w:themeColor="text1"/>
+                      <w:sz w:val="24"/>
+                      <w:szCs w:val="24"/>
+                    </w:rPr>
+                  </w:pPr>
+                  <w:r>
+                    <w:rPr>
+                      <w:noProof/>
+                      <w:color w:val="000000" w:themeColor="text1"/>
+                      <w:sz w:val="24"/>
+                      <w:szCs w:val="24"/>
+                    </w:rPr>
+                    <w:drawing>
+                      <wp:inline distT="0" distB="0" distL="0" distR="0" wp14:anchorId="03761E45" wp14:editId="6573F20A">
                         <wp:extent cx="1128395" cy="1514475"/>
                         <wp:effectExtent l="0" t="0" r="0" b="0"/>
                         <wp:docPr id="22" name="Imagen 22"/>
@@ -9203,7 +10092,7 @@
                                 <pic:cNvPicPr/>
                               </pic:nvPicPr>
                               <pic:blipFill>
-                                <a:blip r:embed="rId44"/>
+                                <a:blip r:embed="rId46"/>
                                 <a:stretch>
                                   <a:fillRect/>
                                 </a:stretch>
@@ -9227,45 +10116,45 @@
               </w:tc>
               <w:tc>
                 <w:tcPr>
-                  <w:tcW w:w="1223" w:type="dxa"/>
+                  <w:tcW w:w="1516" w:type="dxa"/>
                 </w:tcPr>
                 <w:p>
                   <w:pPr>
                     <w:jc w:val="both"/>
                     <w:rPr>
                       <w:color w:val="000000" w:themeColor="text1"/>
-                      <w:sz w:val="24"/>
-                      <w:szCs w:val="24"/>
+                      <w:sz w:val="18"/>
+                      <w:szCs w:val="18"/>
                     </w:rPr>
                   </w:pPr>
                   <w:r>
                     <w:rPr>
                       <w:color w:val="000000" w:themeColor="text1"/>
-                      <w:sz w:val="24"/>
-                      <w:szCs w:val="24"/>
-                    </w:rPr>
-                    <w:t>#0044c6</w:t>
+                      <w:sz w:val="18"/>
+                      <w:szCs w:val="18"/>
+                    </w:rPr>
+                    <w:t>(1, 70, 200)</w:t>
                   </w:r>
                 </w:p>
               </w:tc>
               <w:tc>
                 <w:tcPr>
-                  <w:tcW w:w="1039" w:type="dxa"/>
+                  <w:tcW w:w="668" w:type="dxa"/>
                 </w:tcPr>
                 <w:p>
                   <w:pPr>
                     <w:jc w:val="both"/>
                     <w:rPr>
                       <w:color w:val="000000" w:themeColor="text1"/>
-                      <w:sz w:val="24"/>
-                      <w:szCs w:val="24"/>
+                      <w:sz w:val="18"/>
+                      <w:szCs w:val="18"/>
                     </w:rPr>
                   </w:pPr>
                   <w:r>
                     <w:rPr>
                       <w:color w:val="000000" w:themeColor="text1"/>
-                      <w:sz w:val="24"/>
-                      <w:szCs w:val="24"/>
+                      <w:sz w:val="18"/>
+                      <w:szCs w:val="18"/>
                     </w:rPr>
                     <w:t>29%</w:t>
                   </w:r>
@@ -9274,11 +10163,13 @@
             </w:tr>
             <w:tr>
               <w:trPr>
-                <w:trHeight w:val="607"/>
+                <w:gridAfter w:val="1"/>
+                <w:wAfter w:w="13" w:type="dxa"/>
+                <w:trHeight w:val="442"/>
               </w:trPr>
               <w:tc>
                 <w:tcPr>
-                  <w:tcW w:w="2127" w:type="dxa"/>
+                  <w:tcW w:w="2136" w:type="dxa"/>
                   <w:vMerge/>
                 </w:tcPr>
                 <w:p>
@@ -9294,47 +10185,45 @@
               </w:tc>
               <w:tc>
                 <w:tcPr>
-                  <w:tcW w:w="1275" w:type="dxa"/>
-                  <w:vMerge w:val="restart"/>
+                  <w:tcW w:w="1428" w:type="dxa"/>
                 </w:tcPr>
                 <w:p>
                   <w:pPr>
                     <w:jc w:val="both"/>
                     <w:rPr>
                       <w:color w:val="000000" w:themeColor="text1"/>
-                      <w:sz w:val="22"/>
-                      <w:szCs w:val="22"/>
+                      <w:sz w:val="18"/>
+                      <w:szCs w:val="18"/>
                     </w:rPr>
                   </w:pPr>
                   <w:r>
                     <w:rPr>
                       <w:color w:val="000000" w:themeColor="text1"/>
-                      <w:sz w:val="22"/>
-                      <w:szCs w:val="22"/>
-                    </w:rPr>
-                    <w:t xml:space="preserve">#62ab02 </w:t>
+                      <w:sz w:val="18"/>
+                      <w:szCs w:val="18"/>
+                    </w:rPr>
+                    <w:t>(255, 255, 1)</w:t>
                   </w:r>
                 </w:p>
               </w:tc>
               <w:tc>
                 <w:tcPr>
-                  <w:tcW w:w="851" w:type="dxa"/>
-                  <w:vMerge w:val="restart"/>
+                  <w:tcW w:w="631" w:type="dxa"/>
                 </w:tcPr>
                 <w:p>
                   <w:pPr>
                     <w:jc w:val="both"/>
                     <w:rPr>
                       <w:color w:val="000000" w:themeColor="text1"/>
-                      <w:sz w:val="22"/>
-                      <w:szCs w:val="22"/>
+                      <w:sz w:val="18"/>
+                      <w:szCs w:val="18"/>
                     </w:rPr>
                   </w:pPr>
                   <w:r>
                     <w:rPr>
                       <w:color w:val="000000" w:themeColor="text1"/>
-                      <w:sz w:val="22"/>
-                      <w:szCs w:val="22"/>
+                      <w:sz w:val="18"/>
+                      <w:szCs w:val="18"/>
                     </w:rPr>
                     <w:t>35%</w:t>
                   </w:r>
@@ -9342,7 +10231,8 @@
               </w:tc>
               <w:tc>
                 <w:tcPr>
-                  <w:tcW w:w="1984" w:type="dxa"/>
+                  <w:tcW w:w="2106" w:type="dxa"/>
+                  <w:gridSpan w:val="2"/>
                   <w:vMerge/>
                 </w:tcPr>
                 <w:p>
@@ -9358,45 +10248,321 @@
               </w:tc>
               <w:tc>
                 <w:tcPr>
-                  <w:tcW w:w="1223" w:type="dxa"/>
+                  <w:tcW w:w="1516" w:type="dxa"/>
+                  <w:vMerge w:val="restart"/>
                 </w:tcPr>
                 <w:p>
                   <w:pPr>
                     <w:jc w:val="both"/>
                     <w:rPr>
                       <w:color w:val="000000" w:themeColor="text1"/>
-                      <w:sz w:val="24"/>
-                      <w:szCs w:val="24"/>
+                      <w:sz w:val="18"/>
+                      <w:szCs w:val="18"/>
                     </w:rPr>
                   </w:pPr>
                   <w:r>
                     <w:rPr>
                       <w:color w:val="000000" w:themeColor="text1"/>
-                      <w:sz w:val="24"/>
-                      <w:szCs w:val="24"/>
-                    </w:rPr>
-                    <w:t>#151170</w:t>
+                      <w:sz w:val="18"/>
+                      <w:szCs w:val="18"/>
+                    </w:rPr>
+                    <w:t>(20, 16, 111)</w:t>
                   </w:r>
                 </w:p>
               </w:tc>
               <w:tc>
                 <w:tcPr>
-                  <w:tcW w:w="1039" w:type="dxa"/>
+                  <w:tcW w:w="668" w:type="dxa"/>
+                  <w:vMerge w:val="restart"/>
                 </w:tcPr>
                 <w:p>
                   <w:pPr>
                     <w:jc w:val="both"/>
                     <w:rPr>
                       <w:color w:val="000000" w:themeColor="text1"/>
+                      <w:sz w:val="18"/>
+                      <w:szCs w:val="18"/>
+                    </w:rPr>
+                  </w:pPr>
+                  <w:r>
+                    <w:rPr>
+                      <w:color w:val="000000" w:themeColor="text1"/>
+                      <w:sz w:val="18"/>
+                      <w:szCs w:val="18"/>
+                    </w:rPr>
+                    <w:t>29</w:t>
+                  </w:r>
+                  <w:r>
+                    <w:rPr>
+                      <w:color w:val="000000" w:themeColor="text1"/>
+                      <w:sz w:val="18"/>
+                      <w:szCs w:val="18"/>
+                    </w:rPr>
+                    <w:t>%</w:t>
+                  </w:r>
+                </w:p>
+              </w:tc>
+            </w:tr>
+            <w:tr>
+              <w:trPr>
+                <w:gridAfter w:val="1"/>
+                <w:wAfter w:w="13" w:type="dxa"/>
+                <w:trHeight w:val="294"/>
+              </w:trPr>
+              <w:tc>
+                <w:tcPr>
+                  <w:tcW w:w="2136" w:type="dxa"/>
+                  <w:vMerge/>
+                </w:tcPr>
+                <w:p>
+                  <w:pPr>
+                    <w:jc w:val="both"/>
+                    <w:rPr>
+                      <w:color w:val="000000" w:themeColor="text1"/>
                       <w:sz w:val="24"/>
                       <w:szCs w:val="24"/>
                     </w:rPr>
                   </w:pPr>
+                </w:p>
+              </w:tc>
+              <w:tc>
+                <w:tcPr>
+                  <w:tcW w:w="1428" w:type="dxa"/>
+                  <w:vMerge w:val="restart"/>
+                </w:tcPr>
+                <w:p>
+                  <w:pPr>
+                    <w:jc w:val="both"/>
+                    <w:rPr>
+                      <w:color w:val="000000" w:themeColor="text1"/>
+                      <w:sz w:val="18"/>
+                      <w:szCs w:val="18"/>
+                    </w:rPr>
+                  </w:pPr>
+                </w:p>
+                <w:p>
+                  <w:pPr>
+                    <w:jc w:val="both"/>
+                    <w:rPr>
+                      <w:color w:val="000000" w:themeColor="text1"/>
+                      <w:sz w:val="18"/>
+                      <w:szCs w:val="18"/>
+                    </w:rPr>
+                  </w:pPr>
                   <w:r>
+                    <w:rPr>
+                      <w:color w:val="000000" w:themeColor="text1"/>
+                      <w:sz w:val="18"/>
+                      <w:szCs w:val="18"/>
+                    </w:rPr>
+                    <w:t>(255, 255, 255)</w:t>
+                  </w:r>
+                </w:p>
+              </w:tc>
+              <w:tc>
+                <w:tcPr>
+                  <w:tcW w:w="631" w:type="dxa"/>
+                  <w:vMerge w:val="restart"/>
+                </w:tcPr>
+                <w:p>
+                  <w:pPr>
+                    <w:jc w:val="both"/>
+                    <w:rPr>
+                      <w:color w:val="000000" w:themeColor="text1"/>
+                      <w:sz w:val="18"/>
+                      <w:szCs w:val="18"/>
+                    </w:rPr>
+                  </w:pPr>
+                </w:p>
+                <w:p>
+                  <w:pPr>
+                    <w:jc w:val="both"/>
+                    <w:rPr>
+                      <w:color w:val="000000" w:themeColor="text1"/>
+                      <w:sz w:val="18"/>
+                      <w:szCs w:val="18"/>
+                    </w:rPr>
+                  </w:pPr>
+                  <w:r>
+                    <w:rPr>
+                      <w:color w:val="000000" w:themeColor="text1"/>
+                      <w:sz w:val="18"/>
+                      <w:szCs w:val="18"/>
+                    </w:rPr>
+                    <w:t>15</w:t>
+                  </w:r>
+                  <w:r>
+                    <w:rPr>
+                      <w:color w:val="000000" w:themeColor="text1"/>
+                      <w:sz w:val="18"/>
+                      <w:szCs w:val="18"/>
+                    </w:rPr>
+                    <w:t>%</w:t>
+                  </w:r>
+                </w:p>
+              </w:tc>
+              <w:tc>
+                <w:tcPr>
+                  <w:tcW w:w="2106" w:type="dxa"/>
+                  <w:gridSpan w:val="2"/>
+                  <w:vMerge/>
+                </w:tcPr>
+                <w:p>
+                  <w:pPr>
+                    <w:jc w:val="both"/>
                     <w:rPr>
                       <w:color w:val="000000" w:themeColor="text1"/>
                       <w:sz w:val="24"/>
                       <w:szCs w:val="24"/>
+                    </w:rPr>
+                  </w:pPr>
+                </w:p>
+              </w:tc>
+              <w:tc>
+                <w:tcPr>
+                  <w:tcW w:w="1516" w:type="dxa"/>
+                  <w:vMerge/>
+                </w:tcPr>
+                <w:p>
+                  <w:pPr>
+                    <w:jc w:val="both"/>
+                    <w:rPr>
+                      <w:color w:val="000000" w:themeColor="text1"/>
+                      <w:sz w:val="18"/>
+                      <w:szCs w:val="18"/>
+                    </w:rPr>
+                  </w:pPr>
+                </w:p>
+              </w:tc>
+              <w:tc>
+                <w:tcPr>
+                  <w:tcW w:w="668" w:type="dxa"/>
+                  <w:vMerge/>
+                </w:tcPr>
+                <w:p>
+                  <w:pPr>
+                    <w:jc w:val="both"/>
+                    <w:rPr>
+                      <w:color w:val="000000" w:themeColor="text1"/>
+                      <w:sz w:val="18"/>
+                      <w:szCs w:val="18"/>
+                    </w:rPr>
+                  </w:pPr>
+                </w:p>
+              </w:tc>
+            </w:tr>
+            <w:tr>
+              <w:trPr>
+                <w:gridAfter w:val="1"/>
+                <w:wAfter w:w="13" w:type="dxa"/>
+                <w:trHeight w:val="294"/>
+              </w:trPr>
+              <w:tc>
+                <w:tcPr>
+                  <w:tcW w:w="2136" w:type="dxa"/>
+                  <w:vMerge/>
+                </w:tcPr>
+                <w:p>
+                  <w:pPr>
+                    <w:jc w:val="both"/>
+                    <w:rPr>
+                      <w:color w:val="000000" w:themeColor="text1"/>
+                      <w:sz w:val="24"/>
+                      <w:szCs w:val="24"/>
+                    </w:rPr>
+                  </w:pPr>
+                </w:p>
+              </w:tc>
+              <w:tc>
+                <w:tcPr>
+                  <w:tcW w:w="1428" w:type="dxa"/>
+                  <w:vMerge/>
+                </w:tcPr>
+                <w:p>
+                  <w:pPr>
+                    <w:jc w:val="both"/>
+                    <w:rPr>
+                      <w:color w:val="000000" w:themeColor="text1"/>
+                      <w:sz w:val="18"/>
+                      <w:szCs w:val="18"/>
+                    </w:rPr>
+                  </w:pPr>
+                </w:p>
+              </w:tc>
+              <w:tc>
+                <w:tcPr>
+                  <w:tcW w:w="631" w:type="dxa"/>
+                  <w:vMerge/>
+                </w:tcPr>
+                <w:p>
+                  <w:pPr>
+                    <w:jc w:val="both"/>
+                    <w:rPr>
+                      <w:color w:val="000000" w:themeColor="text1"/>
+                      <w:sz w:val="18"/>
+                      <w:szCs w:val="18"/>
+                    </w:rPr>
+                  </w:pPr>
+                </w:p>
+              </w:tc>
+              <w:tc>
+                <w:tcPr>
+                  <w:tcW w:w="2106" w:type="dxa"/>
+                  <w:gridSpan w:val="2"/>
+                  <w:vMerge/>
+                </w:tcPr>
+                <w:p>
+                  <w:pPr>
+                    <w:jc w:val="both"/>
+                    <w:rPr>
+                      <w:color w:val="000000" w:themeColor="text1"/>
+                      <w:sz w:val="24"/>
+                      <w:szCs w:val="24"/>
+                    </w:rPr>
+                  </w:pPr>
+                </w:p>
+              </w:tc>
+              <w:tc>
+                <w:tcPr>
+                  <w:tcW w:w="1516" w:type="dxa"/>
+                </w:tcPr>
+                <w:p>
+                  <w:pPr>
+                    <w:jc w:val="both"/>
+                    <w:rPr>
+                      <w:color w:val="000000" w:themeColor="text1"/>
+                      <w:sz w:val="18"/>
+                      <w:szCs w:val="18"/>
+                    </w:rPr>
+                  </w:pPr>
+                  <w:r>
+                    <w:rPr>
+                      <w:color w:val="000000" w:themeColor="text1"/>
+                      <w:sz w:val="18"/>
+                      <w:szCs w:val="18"/>
+                    </w:rPr>
+                    <w:t>(251, 128, 0)</w:t>
+                  </w:r>
+                </w:p>
+              </w:tc>
+              <w:tc>
+                <w:tcPr>
+                  <w:tcW w:w="668" w:type="dxa"/>
+                </w:tcPr>
+                <w:p>
+                  <w:pPr>
+                    <w:jc w:val="both"/>
+                    <w:rPr>
+                      <w:color w:val="000000" w:themeColor="text1"/>
+                      <w:sz w:val="18"/>
+                      <w:szCs w:val="18"/>
+                    </w:rPr>
+                  </w:pPr>
+                  <w:r>
+                    <w:rPr>
+                      <w:color w:val="000000" w:themeColor="text1"/>
+                      <w:sz w:val="18"/>
+                      <w:szCs w:val="18"/>
                     </w:rPr>
                     <w:t>29%</w:t>
                   </w:r>
@@ -9405,11 +10571,13 @@
             </w:tr>
             <w:tr>
               <w:trPr>
+                <w:gridAfter w:val="1"/>
+                <w:wAfter w:w="13" w:type="dxa"/>
                 <w:trHeight w:val="294"/>
               </w:trPr>
               <w:tc>
                 <w:tcPr>
-                  <w:tcW w:w="2127" w:type="dxa"/>
+                  <w:tcW w:w="2136" w:type="dxa"/>
                   <w:vMerge/>
                 </w:tcPr>
                 <w:p>
@@ -9425,7 +10593,70 @@
               </w:tc>
               <w:tc>
                 <w:tcPr>
-                  <w:tcW w:w="1275" w:type="dxa"/>
+                  <w:tcW w:w="1428" w:type="dxa"/>
+                </w:tcPr>
+                <w:p>
+                  <w:pPr>
+                    <w:jc w:val="both"/>
+                    <w:rPr>
+                      <w:color w:val="000000" w:themeColor="text1"/>
+                      <w:sz w:val="18"/>
+                      <w:szCs w:val="18"/>
+                    </w:rPr>
+                  </w:pPr>
+                  <w:r>
+                    <w:rPr>
+                      <w:color w:val="000000" w:themeColor="text1"/>
+                      <w:sz w:val="18"/>
+                      <w:szCs w:val="18"/>
+                    </w:rPr>
+                    <w:t>(94, 117, 131)</w:t>
+                  </w:r>
+                </w:p>
+              </w:tc>
+              <w:tc>
+                <w:tcPr>
+                  <w:tcW w:w="631" w:type="dxa"/>
+                </w:tcPr>
+                <w:p>
+                  <w:pPr>
+                    <w:jc w:val="both"/>
+                    <w:rPr>
+                      <w:color w:val="000000" w:themeColor="text1"/>
+                      <w:sz w:val="18"/>
+                      <w:szCs w:val="18"/>
+                    </w:rPr>
+                  </w:pPr>
+                  <w:r>
+                    <w:rPr>
+                      <w:color w:val="000000" w:themeColor="text1"/>
+                      <w:sz w:val="18"/>
+                      <w:szCs w:val="18"/>
+                    </w:rPr>
+                    <w:t>1</w:t>
+                  </w:r>
+                  <w:r>
+                    <w:rPr>
+                      <w:color w:val="000000" w:themeColor="text1"/>
+                      <w:sz w:val="18"/>
+                      <w:szCs w:val="18"/>
+                    </w:rPr>
+                    <w:t>0</w:t>
+                  </w:r>
+                  <w:r>
+                    <w:rPr>
+                      <w:color w:val="000000" w:themeColor="text1"/>
+                      <w:sz w:val="18"/>
+                      <w:szCs w:val="18"/>
+                    </w:rPr>
+                    <w:t>%</w:t>
+                  </w:r>
+                </w:p>
+              </w:tc>
+              <w:tc>
+                <w:tcPr>
+                  <w:tcW w:w="2106" w:type="dxa"/>
+                  <w:gridSpan w:val="2"/>
                   <w:vMerge/>
                 </w:tcPr>
                 <w:p>
@@ -9433,321 +10664,53 @@
                     <w:jc w:val="both"/>
                     <w:rPr>
                       <w:color w:val="000000" w:themeColor="text1"/>
-                      <w:sz w:val="22"/>
-                      <w:szCs w:val="22"/>
+                      <w:sz w:val="24"/>
+                      <w:szCs w:val="24"/>
                     </w:rPr>
                   </w:pPr>
                 </w:p>
               </w:tc>
               <w:tc>
                 <w:tcPr>
-                  <w:tcW w:w="851" w:type="dxa"/>
-                  <w:vMerge/>
+                  <w:tcW w:w="1516" w:type="dxa"/>
                 </w:tcPr>
                 <w:p>
                   <w:pPr>
                     <w:jc w:val="both"/>
                     <w:rPr>
                       <w:color w:val="000000" w:themeColor="text1"/>
-                      <w:sz w:val="22"/>
-                      <w:szCs w:val="22"/>
-                    </w:rPr>
-                  </w:pPr>
-                </w:p>
-              </w:tc>
-              <w:tc>
-                <w:tcPr>
-                  <w:tcW w:w="1984" w:type="dxa"/>
-                  <w:vMerge/>
-                </w:tcPr>
-                <w:p>
-                  <w:pPr>
-                    <w:jc w:val="both"/>
-                    <w:rPr>
-                      <w:color w:val="000000" w:themeColor="text1"/>
-                      <w:sz w:val="24"/>
-                      <w:szCs w:val="24"/>
-                    </w:rPr>
-                  </w:pPr>
-                </w:p>
-              </w:tc>
-              <w:tc>
-                <w:tcPr>
-                  <w:tcW w:w="1223" w:type="dxa"/>
-                  <w:vMerge w:val="restart"/>
-                </w:tcPr>
-                <w:p>
-                  <w:pPr>
-                    <w:jc w:val="both"/>
-                    <w:rPr>
-                      <w:color w:val="000000" w:themeColor="text1"/>
-                      <w:sz w:val="24"/>
-                      <w:szCs w:val="24"/>
+                      <w:sz w:val="18"/>
+                      <w:szCs w:val="18"/>
                     </w:rPr>
                   </w:pPr>
                   <w:r>
                     <w:rPr>
                       <w:color w:val="000000" w:themeColor="text1"/>
-                      <w:sz w:val="24"/>
-                      <w:szCs w:val="24"/>
-                    </w:rPr>
-                    <w:t>#fe8302</w:t>
+                      <w:sz w:val="18"/>
+                      <w:szCs w:val="18"/>
+                    </w:rPr>
+                    <w:t>(75, 159, 2)</w:t>
                   </w:r>
                 </w:p>
               </w:tc>
               <w:tc>
                 <w:tcPr>
-                  <w:tcW w:w="1039" w:type="dxa"/>
-                  <w:vMerge w:val="restart"/>
+                  <w:tcW w:w="668" w:type="dxa"/>
                 </w:tcPr>
                 <w:p>
                   <w:pPr>
                     <w:jc w:val="both"/>
                     <w:rPr>
                       <w:color w:val="000000" w:themeColor="text1"/>
-                      <w:sz w:val="24"/>
-                      <w:szCs w:val="24"/>
+                      <w:sz w:val="18"/>
+                      <w:szCs w:val="18"/>
                     </w:rPr>
                   </w:pPr>
                   <w:r>
                     <w:rPr>
                       <w:color w:val="000000" w:themeColor="text1"/>
-                      <w:sz w:val="24"/>
-                      <w:szCs w:val="24"/>
-                    </w:rPr>
-                    <w:t>29%</w:t>
-                  </w:r>
-                </w:p>
-              </w:tc>
-            </w:tr>
-            <w:tr>
-              <w:trPr>
-                <w:trHeight w:val="294"/>
-              </w:trPr>
-              <w:tc>
-                <w:tcPr>
-                  <w:tcW w:w="2127" w:type="dxa"/>
-                  <w:vMerge/>
-                </w:tcPr>
-                <w:p>
-                  <w:pPr>
-                    <w:jc w:val="both"/>
-                    <w:rPr>
-                      <w:color w:val="000000" w:themeColor="text1"/>
-                      <w:sz w:val="24"/>
-                      <w:szCs w:val="24"/>
-                    </w:rPr>
-                  </w:pPr>
-                </w:p>
-              </w:tc>
-              <w:tc>
-                <w:tcPr>
-                  <w:tcW w:w="1275" w:type="dxa"/>
-                  <w:vMerge w:val="restart"/>
-                </w:tcPr>
-                <w:p>
-                  <w:pPr>
-                    <w:jc w:val="both"/>
-                    <w:rPr>
-                      <w:color w:val="000000" w:themeColor="text1"/>
-                      <w:sz w:val="22"/>
-                      <w:szCs w:val="22"/>
-                    </w:rPr>
-                  </w:pPr>
-                  <w:r>
-                    <w:rPr>
-                      <w:color w:val="000000" w:themeColor="text1"/>
-                      <w:sz w:val="22"/>
-                      <w:szCs w:val="22"/>
-                    </w:rPr>
-                    <w:t xml:space="preserve">#ffffff </w:t>
-                  </w:r>
-                </w:p>
-              </w:tc>
-              <w:tc>
-                <w:tcPr>
-                  <w:tcW w:w="851" w:type="dxa"/>
-                  <w:vMerge w:val="restart"/>
-                </w:tcPr>
-                <w:p>
-                  <w:pPr>
-                    <w:jc w:val="both"/>
-                    <w:rPr>
-                      <w:color w:val="000000" w:themeColor="text1"/>
-                      <w:sz w:val="22"/>
-                      <w:szCs w:val="22"/>
-                    </w:rPr>
-                  </w:pPr>
-                  <w:r>
-                    <w:rPr>
-                      <w:color w:val="000000" w:themeColor="text1"/>
-                      <w:sz w:val="22"/>
-                      <w:szCs w:val="22"/>
-                    </w:rPr>
-                    <w:t>15%</w:t>
-                  </w:r>
-                </w:p>
-              </w:tc>
-              <w:tc>
-                <w:tcPr>
-                  <w:tcW w:w="1984" w:type="dxa"/>
-                  <w:vMerge/>
-                </w:tcPr>
-                <w:p>
-                  <w:pPr>
-                    <w:jc w:val="both"/>
-                    <w:rPr>
-                      <w:color w:val="000000" w:themeColor="text1"/>
-                      <w:sz w:val="24"/>
-                      <w:szCs w:val="24"/>
-                    </w:rPr>
-                  </w:pPr>
-                </w:p>
-              </w:tc>
-              <w:tc>
-                <w:tcPr>
-                  <w:tcW w:w="1223" w:type="dxa"/>
-                  <w:vMerge/>
-                </w:tcPr>
-                <w:p>
-                  <w:pPr>
-                    <w:jc w:val="both"/>
-                    <w:rPr>
-                      <w:color w:val="000000" w:themeColor="text1"/>
-                      <w:sz w:val="24"/>
-                      <w:szCs w:val="24"/>
-                    </w:rPr>
-                  </w:pPr>
-                </w:p>
-              </w:tc>
-              <w:tc>
-                <w:tcPr>
-                  <w:tcW w:w="1039" w:type="dxa"/>
-                  <w:vMerge/>
-                </w:tcPr>
-                <w:p>
-                  <w:pPr>
-                    <w:jc w:val="both"/>
-                    <w:rPr>
-                      <w:color w:val="000000" w:themeColor="text1"/>
-                      <w:sz w:val="24"/>
-                      <w:szCs w:val="24"/>
-                    </w:rPr>
-                  </w:pPr>
-                </w:p>
-              </w:tc>
-            </w:tr>
-            <w:tr>
-              <w:trPr>
-                <w:trHeight w:val="294"/>
-              </w:trPr>
-              <w:tc>
-                <w:tcPr>
-                  <w:tcW w:w="2127" w:type="dxa"/>
-                  <w:vMerge/>
-                </w:tcPr>
-                <w:p>
-                  <w:pPr>
-                    <w:jc w:val="both"/>
-                    <w:rPr>
-                      <w:color w:val="000000" w:themeColor="text1"/>
-                      <w:sz w:val="24"/>
-                      <w:szCs w:val="24"/>
-                    </w:rPr>
-                  </w:pPr>
-                </w:p>
-              </w:tc>
-              <w:tc>
-                <w:tcPr>
-                  <w:tcW w:w="1275" w:type="dxa"/>
-                  <w:vMerge/>
-                </w:tcPr>
-                <w:p>
-                  <w:pPr>
-                    <w:jc w:val="both"/>
-                    <w:rPr>
-                      <w:color w:val="000000" w:themeColor="text1"/>
-                      <w:sz w:val="22"/>
-                      <w:szCs w:val="22"/>
-                    </w:rPr>
-                  </w:pPr>
-                </w:p>
-              </w:tc>
-              <w:tc>
-                <w:tcPr>
-                  <w:tcW w:w="851" w:type="dxa"/>
-                  <w:vMerge/>
-                </w:tcPr>
-                <w:p>
-                  <w:pPr>
-                    <w:jc w:val="both"/>
-                    <w:rPr>
-                      <w:color w:val="000000" w:themeColor="text1"/>
-                      <w:sz w:val="22"/>
-                      <w:szCs w:val="22"/>
-                    </w:rPr>
-                  </w:pPr>
-                </w:p>
-              </w:tc>
-              <w:tc>
-                <w:tcPr>
-                  <w:tcW w:w="1984" w:type="dxa"/>
-                  <w:vMerge/>
-                </w:tcPr>
-                <w:p>
-                  <w:pPr>
-                    <w:jc w:val="both"/>
-                    <w:rPr>
-                      <w:color w:val="000000" w:themeColor="text1"/>
-                      <w:sz w:val="24"/>
-                      <w:szCs w:val="24"/>
-                    </w:rPr>
-                  </w:pPr>
-                </w:p>
-              </w:tc>
-              <w:tc>
-                <w:tcPr>
-                  <w:tcW w:w="1223" w:type="dxa"/>
-                  <w:vMerge w:val="restart"/>
-                </w:tcPr>
-                <w:p>
-                  <w:pPr>
-                    <w:jc w:val="both"/>
-                    <w:rPr>
-                      <w:color w:val="000000" w:themeColor="text1"/>
-                      <w:sz w:val="24"/>
-                      <w:szCs w:val="24"/>
-                    </w:rPr>
-                  </w:pPr>
-                  <w:r>
-                    <w:rPr>
-                      <w:color w:val="000000" w:themeColor="text1"/>
-                      <w:sz w:val="24"/>
-                      <w:szCs w:val="24"/>
-                    </w:rPr>
-                    <w:t>#4f9c00</w:t>
-                  </w:r>
-                </w:p>
-              </w:tc>
-              <w:tc>
-                <w:tcPr>
-                  <w:tcW w:w="1039" w:type="dxa"/>
-                  <w:vMerge w:val="restart"/>
-                </w:tcPr>
-                <w:p>
-                  <w:pPr>
-                    <w:jc w:val="both"/>
-                    <w:rPr>
-                      <w:color w:val="000000" w:themeColor="text1"/>
-                      <w:sz w:val="24"/>
-                      <w:szCs w:val="24"/>
-                    </w:rPr>
-                  </w:pPr>
-                  <w:r>
-                    <w:rPr>
-                      <w:color w:val="000000" w:themeColor="text1"/>
-                      <w:sz w:val="24"/>
-                      <w:szCs w:val="24"/>
+                      <w:sz w:val="18"/>
+                      <w:szCs w:val="18"/>
                     </w:rPr>
                     <w:t>13%</w:t>
                   </w:r>
@@ -9755,107 +10718,10 @@
               </w:tc>
             </w:tr>
             <w:tr>
-              <w:trPr>
-                <w:trHeight w:val="61"/>
-              </w:trPr>
               <w:tc>
                 <w:tcPr>
-                  <w:tcW w:w="2127" w:type="dxa"/>
-                  <w:vMerge/>
-                </w:tcPr>
-                <w:p>
-                  <w:pPr>
-                    <w:jc w:val="both"/>
-                    <w:rPr>
-                      <w:color w:val="000000" w:themeColor="text1"/>
-                      <w:sz w:val="24"/>
-                      <w:szCs w:val="24"/>
-                    </w:rPr>
-                  </w:pPr>
-                </w:p>
-              </w:tc>
-              <w:tc>
-                <w:tcPr>
-                  <w:tcW w:w="1275" w:type="dxa"/>
-                </w:tcPr>
-                <w:p>
-                  <w:pPr>
-                    <w:jc w:val="both"/>
-                    <w:rPr>
-                      <w:color w:val="000000" w:themeColor="text1"/>
-                      <w:sz w:val="22"/>
-                      <w:szCs w:val="22"/>
-                    </w:rPr>
-                  </w:pPr>
-                  <w:r>
-                    <w:rPr>
-                      <w:color w:val="000000" w:themeColor="text1"/>
-                      <w:sz w:val="22"/>
-                      <w:szCs w:val="22"/>
-                    </w:rPr>
-                    <w:t>#ffff0</w:t>
-                  </w:r>
-                </w:p>
-              </w:tc>
-              <w:tc>
-                <w:tcPr>
-                  <w:tcW w:w="851" w:type="dxa"/>
-                </w:tcPr>
-                <w:p>
-                  <w:pPr>
-                    <w:jc w:val="both"/>
-                    <w:rPr>
-                      <w:color w:val="000000" w:themeColor="text1"/>
-                      <w:sz w:val="22"/>
-                      <w:szCs w:val="22"/>
-                    </w:rPr>
-                  </w:pPr>
-                  <w:r>
-                    <w:rPr>
-                      <w:color w:val="000000" w:themeColor="text1"/>
-                      <w:sz w:val="22"/>
-                      <w:szCs w:val="22"/>
-                    </w:rPr>
-                    <w:t>15%</w:t>
-                  </w:r>
-                </w:p>
-              </w:tc>
-              <w:tc>
-                <w:tcPr>
-                  <w:tcW w:w="1984" w:type="dxa"/>
-                  <w:vMerge/>
-                </w:tcPr>
-                <w:p>
-                  <w:pPr>
-                    <w:jc w:val="both"/>
-                    <w:rPr>
-                      <w:color w:val="000000" w:themeColor="text1"/>
-                      <w:sz w:val="24"/>
-                      <w:szCs w:val="24"/>
-                    </w:rPr>
-                  </w:pPr>
-                </w:p>
-              </w:tc>
-              <w:tc>
-                <w:tcPr>
-                  <w:tcW w:w="1223" w:type="dxa"/>
-                  <w:vMerge/>
-                </w:tcPr>
-                <w:p>
-                  <w:pPr>
-                    <w:jc w:val="both"/>
-                    <w:rPr>
-                      <w:color w:val="000000" w:themeColor="text1"/>
-                      <w:sz w:val="24"/>
-                      <w:szCs w:val="24"/>
-                    </w:rPr>
-                  </w:pPr>
-                </w:p>
-              </w:tc>
-              <w:tc>
-                <w:tcPr>
-                  <w:tcW w:w="1039" w:type="dxa"/>
-                  <w:vMerge/>
+                  <w:tcW w:w="8498" w:type="dxa"/>
+                  <w:gridSpan w:val="8"/>
                 </w:tcPr>
                 <w:p>
                   <w:pPr>
@@ -9872,35 +10738,18 @@
             <w:tr>
               <w:tc>
                 <w:tcPr>
-                  <w:tcW w:w="8499" w:type="dxa"/>
-                  <w:gridSpan w:val="6"/>
-                </w:tcPr>
-                <w:p>
-                  <w:pPr>
-                    <w:jc w:val="both"/>
-                    <w:rPr>
-                      <w:color w:val="000000" w:themeColor="text1"/>
-                      <w:sz w:val="24"/>
-                      <w:szCs w:val="24"/>
-                    </w:rPr>
-                  </w:pPr>
-                </w:p>
-              </w:tc>
-            </w:tr>
-            <w:tr>
-              <w:tc>
-                <w:tcPr>
-                  <w:tcW w:w="4253" w:type="dxa"/>
-                  <w:gridSpan w:val="3"/>
+                  <w:tcW w:w="4201" w:type="dxa"/>
+                  <w:gridSpan w:val="4"/>
                   <w:vAlign w:val="center"/>
                 </w:tcPr>
                 <w:p>
                   <w:pPr>
                     <w:jc w:val="center"/>
                     <w:rPr>
-                      <w:color w:val="000000" w:themeColor="text1"/>
-                      <w:sz w:val="24"/>
-                      <w:szCs w:val="24"/>
+                      <w:b/>
+                      <w:bCs/>
+                      <w:sz w:val="32"/>
+                      <w:szCs w:val="32"/>
                     </w:rPr>
                   </w:pPr>
                   <w:r>
@@ -9916,38 +10765,41 @@
               </w:tc>
               <w:tc>
                 <w:tcPr>
-                  <w:tcW w:w="4246" w:type="dxa"/>
-                  <w:gridSpan w:val="3"/>
+                  <w:tcW w:w="4297" w:type="dxa"/>
+                  <w:gridSpan w:val="4"/>
                   <w:vAlign w:val="center"/>
                 </w:tcPr>
                 <w:p>
                   <w:pPr>
                     <w:jc w:val="center"/>
                     <w:rPr>
-                      <w:color w:val="000000" w:themeColor="text1"/>
-                      <w:sz w:val="24"/>
-                      <w:szCs w:val="24"/>
-                    </w:rPr>
-                  </w:pPr>
-                  <w:r>
-                    <w:rPr>
                       <w:b/>
                       <w:bCs/>
                       <w:sz w:val="32"/>
                       <w:szCs w:val="32"/>
                     </w:rPr>
-                    <w:t>Barato</w:t>
+                  </w:pPr>
+                  <w:r>
+                    <w:rPr>
+                      <w:b/>
+                      <w:bCs/>
+                      <w:sz w:val="32"/>
+                      <w:szCs w:val="32"/>
+                    </w:rPr>
+                    <w:t>Envidia</w:t>
                   </w:r>
                 </w:p>
               </w:tc>
             </w:tr>
             <w:tr>
               <w:trPr>
-                <w:trHeight w:val="798"/>
+                <w:gridAfter w:val="1"/>
+                <w:wAfter w:w="13" w:type="dxa"/>
+                <w:trHeight w:val="532"/>
               </w:trPr>
               <w:tc>
                 <w:tcPr>
-                  <w:tcW w:w="2127" w:type="dxa"/>
+                  <w:tcW w:w="2136" w:type="dxa"/>
                   <w:vMerge w:val="restart"/>
                 </w:tcPr>
                 <w:p>
@@ -9967,7 +10819,7 @@
                       <w:szCs w:val="24"/>
                     </w:rPr>
                     <w:drawing>
-                      <wp:inline distT="0" distB="0" distL="0" distR="0" wp14:anchorId="16A34E42" wp14:editId="11FDEAFC">
+                      <wp:inline distT="0" distB="0" distL="0" distR="0" wp14:anchorId="3F8FE9A0" wp14:editId="0F027346">
                         <wp:extent cx="1213485" cy="1435735"/>
                         <wp:effectExtent l="0" t="0" r="5715" b="0"/>
                         <wp:docPr id="26" name="Imagen 26"/>
@@ -9982,7 +10834,7 @@
                                 <pic:cNvPicPr/>
                               </pic:nvPicPr>
                               <pic:blipFill>
-                                <a:blip r:embed="rId45"/>
+                                <a:blip r:embed="rId47"/>
                                 <a:stretch>
                                   <a:fillRect/>
                                 </a:stretch>
@@ -10006,61 +10858,56 @@
               </w:tc>
               <w:tc>
                 <w:tcPr>
-                  <w:tcW w:w="1275" w:type="dxa"/>
+                  <w:tcW w:w="1428" w:type="dxa"/>
+                  <w:vMerge w:val="restart"/>
                 </w:tcPr>
                 <w:p>
                   <w:pPr>
                     <w:jc w:val="both"/>
                     <w:rPr>
                       <w:color w:val="000000" w:themeColor="text1"/>
-                      <w:sz w:val="22"/>
-                      <w:szCs w:val="22"/>
+                      <w:sz w:val="18"/>
+                      <w:szCs w:val="18"/>
                     </w:rPr>
                   </w:pPr>
                   <w:r>
                     <w:rPr>
                       <w:color w:val="000000" w:themeColor="text1"/>
-                      <w:sz w:val="22"/>
-                      <w:szCs w:val="22"/>
-                    </w:rPr>
-                    <w:t>#e40903</w:t>
+                      <w:sz w:val="18"/>
+                      <w:szCs w:val="18"/>
+                    </w:rPr>
+                    <w:t>(232, 10, 5)</w:t>
                   </w:r>
                 </w:p>
               </w:tc>
               <w:tc>
                 <w:tcPr>
-                  <w:tcW w:w="851" w:type="dxa"/>
+                  <w:tcW w:w="631" w:type="dxa"/>
+                  <w:vMerge w:val="restart"/>
                 </w:tcPr>
                 <w:p>
                   <w:pPr>
                     <w:jc w:val="both"/>
                     <w:rPr>
                       <w:color w:val="000000" w:themeColor="text1"/>
-                      <w:sz w:val="22"/>
-                      <w:szCs w:val="22"/>
+                      <w:sz w:val="18"/>
+                      <w:szCs w:val="18"/>
                     </w:rPr>
                   </w:pPr>
                   <w:r>
                     <w:rPr>
                       <w:color w:val="000000" w:themeColor="text1"/>
-                      <w:sz w:val="22"/>
-                      <w:szCs w:val="22"/>
-                    </w:rPr>
-                    <w:t>43</w:t>
-                  </w:r>
-                  <w:r>
-                    <w:rPr>
-                      <w:color w:val="000000" w:themeColor="text1"/>
-                      <w:sz w:val="22"/>
-                      <w:szCs w:val="22"/>
-                    </w:rPr>
-                    <w:t>%</w:t>
+                      <w:sz w:val="18"/>
+                      <w:szCs w:val="18"/>
+                    </w:rPr>
+                    <w:t>43%</w:t>
                   </w:r>
                 </w:p>
               </w:tc>
               <w:tc>
                 <w:tcPr>
-                  <w:tcW w:w="1984" w:type="dxa"/>
+                  <w:tcW w:w="2106" w:type="dxa"/>
+                  <w:gridSpan w:val="2"/>
                   <w:vMerge w:val="restart"/>
                 </w:tcPr>
                 <w:p>
@@ -10080,598 +10927,7 @@
                       <w:szCs w:val="24"/>
                     </w:rPr>
                     <w:drawing>
-                      <wp:inline distT="0" distB="0" distL="0" distR="0" wp14:anchorId="552C7114" wp14:editId="24FAFA90">
-                        <wp:extent cx="1122680" cy="1340485"/>
-                        <wp:effectExtent l="0" t="0" r="1270" b="0"/>
-                        <wp:docPr id="27" name="Imagen 27"/>
-                        <wp:cNvGraphicFramePr>
-                          <a:graphicFrameLocks xmlns:a="http://schemas.openxmlformats.org/drawingml/2006/main" noChangeAspect="1"/>
-                        </wp:cNvGraphicFramePr>
-                        <a:graphic xmlns:a="http://schemas.openxmlformats.org/drawingml/2006/main">
-                          <a:graphicData uri="http://schemas.openxmlformats.org/drawingml/2006/picture">
-                            <pic:pic xmlns:pic="http://schemas.openxmlformats.org/drawingml/2006/picture">
-                              <pic:nvPicPr>
-                                <pic:cNvPr id="1" name=""/>
-                                <pic:cNvPicPr/>
-                              </pic:nvPicPr>
-                              <pic:blipFill>
-                                <a:blip r:embed="rId46"/>
-                                <a:stretch>
-                                  <a:fillRect/>
-                                </a:stretch>
-                              </pic:blipFill>
-                              <pic:spPr>
-                                <a:xfrm>
-                                  <a:off x="0" y="0"/>
-                                  <a:ext cx="1122680" cy="1340485"/>
-                                </a:xfrm>
-                                <a:prstGeom prst="rect">
-                                  <a:avLst/>
-                                </a:prstGeom>
-                              </pic:spPr>
-                            </pic:pic>
-                          </a:graphicData>
-                        </a:graphic>
-                      </wp:inline>
-                    </w:drawing>
-                  </w:r>
-                </w:p>
-              </w:tc>
-              <w:tc>
-                <w:tcPr>
-                  <w:tcW w:w="1223" w:type="dxa"/>
-                </w:tcPr>
-                <w:p>
-                  <w:pPr>
-                    <w:jc w:val="both"/>
-                    <w:rPr>
-                      <w:color w:val="000000" w:themeColor="text1"/>
-                      <w:sz w:val="22"/>
-                      <w:szCs w:val="22"/>
-                    </w:rPr>
-                  </w:pPr>
-                  <w:r>
-                    <w:rPr>
-                      <w:color w:val="000000" w:themeColor="text1"/>
-                      <w:sz w:val="22"/>
-                      <w:szCs w:val="22"/>
-                    </w:rPr>
-                    <w:t>#ffb8e2</w:t>
-                  </w:r>
-                </w:p>
-              </w:tc>
-              <w:tc>
-                <w:tcPr>
-                  <w:tcW w:w="1039" w:type="dxa"/>
-                </w:tcPr>
-                <w:p>
-                  <w:pPr>
-                    <w:jc w:val="both"/>
-                    <w:rPr>
-                      <w:color w:val="000000" w:themeColor="text1"/>
-                      <w:sz w:val="22"/>
-                      <w:szCs w:val="22"/>
-                    </w:rPr>
-                  </w:pPr>
-                  <w:r>
-                    <w:rPr>
-                      <w:color w:val="000000" w:themeColor="text1"/>
-                      <w:sz w:val="22"/>
-                      <w:szCs w:val="22"/>
-                    </w:rPr>
-                    <w:t>4</w:t>
-                  </w:r>
-                  <w:r>
-                    <w:rPr>
-                      <w:color w:val="000000" w:themeColor="text1"/>
-                      <w:sz w:val="22"/>
-                      <w:szCs w:val="22"/>
-                    </w:rPr>
-                    <w:t>0%</w:t>
-                  </w:r>
-                </w:p>
-              </w:tc>
-            </w:tr>
-            <w:tr>
-              <w:trPr>
-                <w:trHeight w:val="607"/>
-              </w:trPr>
-              <w:tc>
-                <w:tcPr>
-                  <w:tcW w:w="2127" w:type="dxa"/>
-                  <w:vMerge/>
-                </w:tcPr>
-                <w:p>
-                  <w:pPr>
-                    <w:jc w:val="both"/>
-                    <w:rPr>
-                      <w:color w:val="000000" w:themeColor="text1"/>
-                      <w:sz w:val="24"/>
-                      <w:szCs w:val="24"/>
-                    </w:rPr>
-                  </w:pPr>
-                </w:p>
-              </w:tc>
-              <w:tc>
-                <w:tcPr>
-                  <w:tcW w:w="1275" w:type="dxa"/>
-                  <w:vMerge w:val="restart"/>
-                </w:tcPr>
-                <w:p>
-                  <w:pPr>
-                    <w:jc w:val="both"/>
-                    <w:rPr>
-                      <w:color w:val="000000" w:themeColor="text1"/>
-                      <w:sz w:val="22"/>
-                      <w:szCs w:val="22"/>
-                    </w:rPr>
-                  </w:pPr>
-                  <w:r>
-                    <w:rPr>
-                      <w:color w:val="000000" w:themeColor="text1"/>
-                      <w:sz w:val="22"/>
-                      <w:szCs w:val="22"/>
-                    </w:rPr>
-                    <w:t>#000000</w:t>
-                  </w:r>
-                </w:p>
-              </w:tc>
-              <w:tc>
-                <w:tcPr>
-                  <w:tcW w:w="851" w:type="dxa"/>
-                  <w:vMerge w:val="restart"/>
-                </w:tcPr>
-                <w:p>
-                  <w:pPr>
-                    <w:jc w:val="both"/>
-                    <w:rPr>
-                      <w:color w:val="000000" w:themeColor="text1"/>
-                      <w:sz w:val="22"/>
-                      <w:szCs w:val="22"/>
-                    </w:rPr>
-                  </w:pPr>
-                  <w:r>
-                    <w:rPr>
-                      <w:color w:val="000000" w:themeColor="text1"/>
-                      <w:sz w:val="22"/>
-                      <w:szCs w:val="22"/>
-                    </w:rPr>
-                    <w:t>43</w:t>
-                  </w:r>
-                  <w:r>
-                    <w:rPr>
-                      <w:color w:val="000000" w:themeColor="text1"/>
-                      <w:sz w:val="22"/>
-                      <w:szCs w:val="22"/>
-                    </w:rPr>
-                    <w:t>%</w:t>
-                  </w:r>
-                </w:p>
-              </w:tc>
-              <w:tc>
-                <w:tcPr>
-                  <w:tcW w:w="1984" w:type="dxa"/>
-                  <w:vMerge/>
-                </w:tcPr>
-                <w:p>
-                  <w:pPr>
-                    <w:jc w:val="both"/>
-                    <w:rPr>
-                      <w:color w:val="000000" w:themeColor="text1"/>
-                      <w:sz w:val="24"/>
-                      <w:szCs w:val="24"/>
-                    </w:rPr>
-                  </w:pPr>
-                </w:p>
-              </w:tc>
-              <w:tc>
-                <w:tcPr>
-                  <w:tcW w:w="1223" w:type="dxa"/>
-                </w:tcPr>
-                <w:p>
-                  <w:pPr>
-                    <w:jc w:val="both"/>
-                    <w:rPr>
-                      <w:color w:val="000000" w:themeColor="text1"/>
-                      <w:sz w:val="22"/>
-                      <w:szCs w:val="22"/>
-                    </w:rPr>
-                  </w:pPr>
-                  <w:r>
-                    <w:rPr>
-                      <w:color w:val="000000" w:themeColor="text1"/>
-                      <w:sz w:val="22"/>
-                      <w:szCs w:val="22"/>
-                    </w:rPr>
-                    <w:t>#f97700</w:t>
-                  </w:r>
-                </w:p>
-              </w:tc>
-              <w:tc>
-                <w:tcPr>
-                  <w:tcW w:w="1039" w:type="dxa"/>
-                </w:tcPr>
-                <w:p>
-                  <w:pPr>
-                    <w:jc w:val="both"/>
-                    <w:rPr>
-                      <w:color w:val="000000" w:themeColor="text1"/>
-                      <w:sz w:val="22"/>
-                      <w:szCs w:val="22"/>
-                    </w:rPr>
-                  </w:pPr>
-                  <w:r>
-                    <w:rPr>
-                      <w:color w:val="000000" w:themeColor="text1"/>
-                      <w:sz w:val="22"/>
-                      <w:szCs w:val="22"/>
-                    </w:rPr>
-                    <w:t>2</w:t>
-                  </w:r>
-                  <w:r>
-                    <w:rPr>
-                      <w:color w:val="000000" w:themeColor="text1"/>
-                      <w:sz w:val="22"/>
-                      <w:szCs w:val="22"/>
-                    </w:rPr>
-                    <w:t>0</w:t>
-                  </w:r>
-                </w:p>
-              </w:tc>
-            </w:tr>
-            <w:tr>
-              <w:trPr>
-                <w:trHeight w:val="294"/>
-              </w:trPr>
-              <w:tc>
-                <w:tcPr>
-                  <w:tcW w:w="2127" w:type="dxa"/>
-                  <w:vMerge/>
-                </w:tcPr>
-                <w:p>
-                  <w:pPr>
-                    <w:jc w:val="both"/>
-                    <w:rPr>
-                      <w:color w:val="000000" w:themeColor="text1"/>
-                      <w:sz w:val="24"/>
-                      <w:szCs w:val="24"/>
-                    </w:rPr>
-                  </w:pPr>
-                </w:p>
-              </w:tc>
-              <w:tc>
-                <w:tcPr>
-                  <w:tcW w:w="1275" w:type="dxa"/>
-                  <w:vMerge/>
-                </w:tcPr>
-                <w:p>
-                  <w:pPr>
-                    <w:jc w:val="both"/>
-                    <w:rPr>
-                      <w:color w:val="000000" w:themeColor="text1"/>
-                      <w:sz w:val="22"/>
-                      <w:szCs w:val="22"/>
-                    </w:rPr>
-                  </w:pPr>
-                </w:p>
-              </w:tc>
-              <w:tc>
-                <w:tcPr>
-                  <w:tcW w:w="851" w:type="dxa"/>
-                  <w:vMerge/>
-                </w:tcPr>
-                <w:p>
-                  <w:pPr>
-                    <w:jc w:val="both"/>
-                    <w:rPr>
-                      <w:color w:val="000000" w:themeColor="text1"/>
-                      <w:sz w:val="22"/>
-                      <w:szCs w:val="22"/>
-                    </w:rPr>
-                  </w:pPr>
-                </w:p>
-              </w:tc>
-              <w:tc>
-                <w:tcPr>
-                  <w:tcW w:w="1984" w:type="dxa"/>
-                  <w:vMerge/>
-                </w:tcPr>
-                <w:p>
-                  <w:pPr>
-                    <w:jc w:val="both"/>
-                    <w:rPr>
-                      <w:color w:val="000000" w:themeColor="text1"/>
-                      <w:sz w:val="24"/>
-                      <w:szCs w:val="24"/>
-                    </w:rPr>
-                  </w:pPr>
-                </w:p>
-              </w:tc>
-              <w:tc>
-                <w:tcPr>
-                  <w:tcW w:w="1223" w:type="dxa"/>
-                </w:tcPr>
-                <w:p>
-                  <w:pPr>
-                    <w:jc w:val="both"/>
-                    <w:rPr>
-                      <w:color w:val="000000" w:themeColor="text1"/>
-                      <w:sz w:val="22"/>
-                      <w:szCs w:val="22"/>
-                    </w:rPr>
-                  </w:pPr>
-                  <w:r>
-                    <w:rPr>
-                      <w:color w:val="000000" w:themeColor="text1"/>
-                      <w:sz w:val="22"/>
-                      <w:szCs w:val="22"/>
-                    </w:rPr>
-                    <w:t>#576363</w:t>
-                  </w:r>
-                </w:p>
-              </w:tc>
-              <w:tc>
-                <w:tcPr>
-                  <w:tcW w:w="1039" w:type="dxa"/>
-                </w:tcPr>
-                <w:p>
-                  <w:pPr>
-                    <w:jc w:val="both"/>
-                    <w:rPr>
-                      <w:color w:val="000000" w:themeColor="text1"/>
-                      <w:sz w:val="22"/>
-                      <w:szCs w:val="22"/>
-                    </w:rPr>
-                  </w:pPr>
-                  <w:r>
-                    <w:rPr>
-                      <w:color w:val="000000" w:themeColor="text1"/>
-                      <w:sz w:val="22"/>
-                      <w:szCs w:val="22"/>
-                    </w:rPr>
-                    <w:t>25</w:t>
-                  </w:r>
-                  <w:r>
-                    <w:rPr>
-                      <w:color w:val="000000" w:themeColor="text1"/>
-                      <w:sz w:val="22"/>
-                      <w:szCs w:val="22"/>
-                    </w:rPr>
-                    <w:t>%</w:t>
-                  </w:r>
-                </w:p>
-              </w:tc>
-            </w:tr>
-            <w:tr>
-              <w:trPr>
-                <w:trHeight w:val="294"/>
-              </w:trPr>
-              <w:tc>
-                <w:tcPr>
-                  <w:tcW w:w="2127" w:type="dxa"/>
-                  <w:vMerge/>
-                </w:tcPr>
-                <w:p>
-                  <w:pPr>
-                    <w:jc w:val="both"/>
-                    <w:rPr>
-                      <w:color w:val="000000" w:themeColor="text1"/>
-                      <w:sz w:val="24"/>
-                      <w:szCs w:val="24"/>
-                    </w:rPr>
-                  </w:pPr>
-                </w:p>
-              </w:tc>
-              <w:tc>
-                <w:tcPr>
-                  <w:tcW w:w="1275" w:type="dxa"/>
-                </w:tcPr>
-                <w:p>
-                  <w:pPr>
-                    <w:jc w:val="both"/>
-                    <w:rPr>
-                      <w:color w:val="000000" w:themeColor="text1"/>
-                      <w:sz w:val="22"/>
-                      <w:szCs w:val="22"/>
-                    </w:rPr>
-                  </w:pPr>
-                  <w:r>
-                    <w:rPr>
-                      <w:color w:val="000000" w:themeColor="text1"/>
-                      <w:sz w:val="22"/>
-                      <w:szCs w:val="22"/>
-                    </w:rPr>
-                    <w:t>#ffff01</w:t>
-                  </w:r>
-                </w:p>
-              </w:tc>
-              <w:tc>
-                <w:tcPr>
-                  <w:tcW w:w="851" w:type="dxa"/>
-                </w:tcPr>
-                <w:p>
-                  <w:pPr>
-                    <w:jc w:val="both"/>
-                    <w:rPr>
-                      <w:color w:val="000000" w:themeColor="text1"/>
-                      <w:sz w:val="22"/>
-                      <w:szCs w:val="22"/>
-                    </w:rPr>
-                  </w:pPr>
-                  <w:r>
-                    <w:rPr>
-                      <w:color w:val="000000" w:themeColor="text1"/>
-                      <w:sz w:val="22"/>
-                      <w:szCs w:val="22"/>
-                    </w:rPr>
-                    <w:t>14%</w:t>
-                  </w:r>
-                </w:p>
-              </w:tc>
-              <w:tc>
-                <w:tcPr>
-                  <w:tcW w:w="1984" w:type="dxa"/>
-                  <w:vMerge/>
-                </w:tcPr>
-                <w:p>
-                  <w:pPr>
-                    <w:jc w:val="both"/>
-                    <w:rPr>
-                      <w:color w:val="000000" w:themeColor="text1"/>
-                      <w:sz w:val="24"/>
-                      <w:szCs w:val="24"/>
-                    </w:rPr>
-                  </w:pPr>
-                </w:p>
-              </w:tc>
-              <w:tc>
-                <w:tcPr>
-                  <w:tcW w:w="1223" w:type="dxa"/>
-                </w:tcPr>
-                <w:p>
-                  <w:pPr>
-                    <w:jc w:val="both"/>
-                    <w:rPr>
-                      <w:color w:val="000000" w:themeColor="text1"/>
-                      <w:sz w:val="24"/>
-                      <w:szCs w:val="24"/>
-                    </w:rPr>
-                  </w:pPr>
-                  <w:r>
-                    <w:rPr>
-                      <w:color w:val="000000" w:themeColor="text1"/>
-                      <w:sz w:val="24"/>
-                      <w:szCs w:val="24"/>
-                    </w:rPr>
-                    <w:t>#602100</w:t>
-                  </w:r>
-                </w:p>
-              </w:tc>
-              <w:tc>
-                <w:tcPr>
-                  <w:tcW w:w="1039" w:type="dxa"/>
-                </w:tcPr>
-                <w:p>
-                  <w:pPr>
-                    <w:jc w:val="both"/>
-                    <w:rPr>
-                      <w:color w:val="000000" w:themeColor="text1"/>
-                      <w:sz w:val="24"/>
-                      <w:szCs w:val="24"/>
-                    </w:rPr>
-                  </w:pPr>
-                  <w:r>
-                    <w:rPr>
-                      <w:color w:val="000000" w:themeColor="text1"/>
-                      <w:sz w:val="24"/>
-                      <w:szCs w:val="24"/>
-                    </w:rPr>
-                    <w:t>15%</w:t>
-                  </w:r>
-                </w:p>
-              </w:tc>
-            </w:tr>
-            <w:tr>
-              <w:tc>
-                <w:tcPr>
-                  <w:tcW w:w="8499" w:type="dxa"/>
-                  <w:gridSpan w:val="6"/>
-                </w:tcPr>
-                <w:p>
-                  <w:pPr>
-                    <w:jc w:val="both"/>
-                    <w:rPr>
-                      <w:color w:val="000000" w:themeColor="text1"/>
-                      <w:sz w:val="24"/>
-                      <w:szCs w:val="24"/>
-                    </w:rPr>
-                  </w:pPr>
-                </w:p>
-              </w:tc>
-            </w:tr>
-            <w:tr>
-              <w:tc>
-                <w:tcPr>
-                  <w:tcW w:w="4253" w:type="dxa"/>
-                  <w:gridSpan w:val="3"/>
-                  <w:vAlign w:val="center"/>
-                </w:tcPr>
-                <w:p>
-                  <w:pPr>
-                    <w:jc w:val="center"/>
-                    <w:rPr>
-                      <w:b/>
-                      <w:bCs/>
-                      <w:sz w:val="32"/>
-                      <w:szCs w:val="32"/>
-                    </w:rPr>
-                  </w:pPr>
-                  <w:r>
-                    <w:rPr>
-                      <w:b/>
-                      <w:bCs/>
-                      <w:sz w:val="32"/>
-                      <w:szCs w:val="32"/>
-                    </w:rPr>
-                    <w:t>Envidia</w:t>
-                  </w:r>
-                </w:p>
-              </w:tc>
-              <w:tc>
-                <w:tcPr>
-                  <w:tcW w:w="4246" w:type="dxa"/>
-                  <w:gridSpan w:val="3"/>
-                  <w:vAlign w:val="center"/>
-                </w:tcPr>
-                <w:p>
-                  <w:pPr>
-                    <w:jc w:val="center"/>
-                    <w:rPr>
-                      <w:b/>
-                      <w:bCs/>
-                      <w:sz w:val="32"/>
-                      <w:szCs w:val="32"/>
-                    </w:rPr>
-                  </w:pPr>
-                  <w:r>
-                    <w:rPr>
-                      <w:b/>
-                      <w:bCs/>
-                      <w:sz w:val="32"/>
-                      <w:szCs w:val="32"/>
-                    </w:rPr>
-                    <w:t>Infidelidad</w:t>
-                  </w:r>
-                </w:p>
-              </w:tc>
-            </w:tr>
-            <w:tr>
-              <w:trPr>
-                <w:trHeight w:val="1011"/>
-              </w:trPr>
-              <w:tc>
-                <w:tcPr>
-                  <w:tcW w:w="2127" w:type="dxa"/>
-                  <w:vMerge w:val="restart"/>
-                </w:tcPr>
-                <w:p>
-                  <w:pPr>
-                    <w:jc w:val="both"/>
-                    <w:rPr>
-                      <w:color w:val="000000" w:themeColor="text1"/>
-                      <w:sz w:val="24"/>
-                      <w:szCs w:val="24"/>
-                    </w:rPr>
-                  </w:pPr>
-                  <w:r>
-                    <w:rPr>
-                      <w:noProof/>
-                      <w:color w:val="000000" w:themeColor="text1"/>
-                      <w:sz w:val="24"/>
-                      <w:szCs w:val="24"/>
-                    </w:rPr>
-                    <w:drawing>
-                      <wp:inline distT="0" distB="0" distL="0" distR="0" wp14:anchorId="4B6B282D" wp14:editId="68F11339">
+                      <wp:inline distT="0" distB="0" distL="0" distR="0" wp14:anchorId="07C9C118" wp14:editId="620158DC">
                         <wp:extent cx="1200150" cy="1481137"/>
                         <wp:effectExtent l="0" t="0" r="0" b="5080"/>
                         <wp:docPr id="46" name="Imagen 46"/>
@@ -10686,7 +10942,7 @@
                                 <pic:cNvPicPr/>
                               </pic:nvPicPr>
                               <pic:blipFill>
-                                <a:blip r:embed="rId47"/>
+                                <a:blip r:embed="rId48"/>
                                 <a:stretch>
                                   <a:fillRect/>
                                 </a:stretch>
@@ -10710,166 +10966,304 @@
               </w:tc>
               <w:tc>
                 <w:tcPr>
-                  <w:tcW w:w="1275" w:type="dxa"/>
+                  <w:tcW w:w="1516" w:type="dxa"/>
                 </w:tcPr>
                 <w:p>
                   <w:pPr>
                     <w:jc w:val="both"/>
                     <w:rPr>
                       <w:color w:val="000000" w:themeColor="text1"/>
-                      <w:sz w:val="22"/>
-                      <w:szCs w:val="22"/>
+                      <w:sz w:val="18"/>
+                      <w:szCs w:val="18"/>
                     </w:rPr>
                   </w:pPr>
                   <w:r>
                     <w:rPr>
                       <w:color w:val="000000" w:themeColor="text1"/>
-                      <w:sz w:val="22"/>
-                      <w:szCs w:val="22"/>
-                    </w:rPr>
-                    <w:t>#ffff01</w:t>
+                      <w:sz w:val="18"/>
+                      <w:szCs w:val="18"/>
+                    </w:rPr>
+                    <w:t>(255, 255, 1)</w:t>
                   </w:r>
                 </w:p>
               </w:tc>
               <w:tc>
                 <w:tcPr>
-                  <w:tcW w:w="851" w:type="dxa"/>
+                  <w:tcW w:w="668" w:type="dxa"/>
                 </w:tcPr>
                 <w:p>
                   <w:pPr>
                     <w:jc w:val="both"/>
                     <w:rPr>
                       <w:color w:val="000000" w:themeColor="text1"/>
-                      <w:sz w:val="22"/>
-                      <w:szCs w:val="22"/>
+                      <w:sz w:val="18"/>
+                      <w:szCs w:val="18"/>
                     </w:rPr>
                   </w:pPr>
                   <w:r>
                     <w:rPr>
                       <w:color w:val="000000" w:themeColor="text1"/>
-                      <w:sz w:val="22"/>
-                      <w:szCs w:val="22"/>
-                    </w:rPr>
-                    <w:t>55</w:t>
+                      <w:sz w:val="18"/>
+                      <w:szCs w:val="18"/>
+                    </w:rPr>
+                    <w:t>55%</w:t>
                   </w:r>
+                </w:p>
+              </w:tc>
+            </w:tr>
+            <w:tr>
+              <w:trPr>
+                <w:gridAfter w:val="1"/>
+                <w:wAfter w:w="13" w:type="dxa"/>
+                <w:trHeight w:val="473"/>
+              </w:trPr>
+              <w:tc>
+                <w:tcPr>
+                  <w:tcW w:w="2136" w:type="dxa"/>
+                  <w:vMerge/>
+                </w:tcPr>
+                <w:p>
+                  <w:pPr>
+                    <w:jc w:val="both"/>
+                    <w:rPr>
+                      <w:noProof/>
+                      <w:color w:val="000000" w:themeColor="text1"/>
+                      <w:sz w:val="24"/>
+                      <w:szCs w:val="24"/>
+                    </w:rPr>
+                  </w:pPr>
+                </w:p>
+              </w:tc>
+              <w:tc>
+                <w:tcPr>
+                  <w:tcW w:w="1428" w:type="dxa"/>
+                  <w:vMerge/>
+                </w:tcPr>
+                <w:p>
+                  <w:pPr>
+                    <w:jc w:val="both"/>
+                    <w:rPr>
+                      <w:color w:val="000000" w:themeColor="text1"/>
+                      <w:sz w:val="18"/>
+                      <w:szCs w:val="18"/>
+                    </w:rPr>
+                  </w:pPr>
+                </w:p>
+              </w:tc>
+              <w:tc>
+                <w:tcPr>
+                  <w:tcW w:w="631" w:type="dxa"/>
+                  <w:vMerge/>
+                </w:tcPr>
+                <w:p>
+                  <w:pPr>
+                    <w:jc w:val="both"/>
+                    <w:rPr>
+                      <w:color w:val="000000" w:themeColor="text1"/>
+                      <w:sz w:val="18"/>
+                      <w:szCs w:val="18"/>
+                    </w:rPr>
+                  </w:pPr>
+                </w:p>
+              </w:tc>
+              <w:tc>
+                <w:tcPr>
+                  <w:tcW w:w="2106" w:type="dxa"/>
+                  <w:gridSpan w:val="2"/>
+                  <w:vMerge/>
+                </w:tcPr>
+                <w:p>
+                  <w:pPr>
+                    <w:jc w:val="both"/>
+                    <w:rPr>
+                      <w:color w:val="000000" w:themeColor="text1"/>
+                      <w:sz w:val="24"/>
+                      <w:szCs w:val="24"/>
+                    </w:rPr>
+                  </w:pPr>
+                </w:p>
+              </w:tc>
+              <w:tc>
+                <w:tcPr>
+                  <w:tcW w:w="1516" w:type="dxa"/>
+                </w:tcPr>
+                <w:p>
+                  <w:pPr>
+                    <w:jc w:val="both"/>
+                    <w:rPr>
+                      <w:color w:val="000000" w:themeColor="text1"/>
+                      <w:sz w:val="18"/>
+                      <w:szCs w:val="18"/>
+                    </w:rPr>
+                  </w:pPr>
                   <w:r>
                     <w:rPr>
                       <w:color w:val="000000" w:themeColor="text1"/>
-                      <w:sz w:val="22"/>
-                      <w:szCs w:val="22"/>
-                    </w:rPr>
-                    <w:t>%</w:t>
+                      <w:sz w:val="18"/>
+                      <w:szCs w:val="18"/>
+                    </w:rPr>
+                    <w:t>(97, 170, 1)</w:t>
                   </w:r>
                 </w:p>
               </w:tc>
               <w:tc>
                 <w:tcPr>
-                  <w:tcW w:w="1984" w:type="dxa"/>
-                  <w:vMerge w:val="restart"/>
+                  <w:tcW w:w="668" w:type="dxa"/>
                 </w:tcPr>
                 <w:p>
                   <w:pPr>
                     <w:jc w:val="both"/>
                     <w:rPr>
                       <w:color w:val="000000" w:themeColor="text1"/>
+                      <w:sz w:val="18"/>
+                      <w:szCs w:val="18"/>
+                    </w:rPr>
+                  </w:pPr>
+                  <w:r>
+                    <w:rPr>
+                      <w:color w:val="000000" w:themeColor="text1"/>
+                      <w:sz w:val="18"/>
+                      <w:szCs w:val="18"/>
+                    </w:rPr>
+                    <w:t>25%</w:t>
+                  </w:r>
+                </w:p>
+              </w:tc>
+            </w:tr>
+            <w:tr>
+              <w:trPr>
+                <w:gridAfter w:val="1"/>
+                <w:wAfter w:w="13" w:type="dxa"/>
+                <w:trHeight w:val="607"/>
+              </w:trPr>
+              <w:tc>
+                <w:tcPr>
+                  <w:tcW w:w="2136" w:type="dxa"/>
+                  <w:vMerge/>
+                </w:tcPr>
+                <w:p>
+                  <w:pPr>
+                    <w:jc w:val="both"/>
+                    <w:rPr>
+                      <w:color w:val="000000" w:themeColor="text1"/>
                       <w:sz w:val="24"/>
                       <w:szCs w:val="24"/>
                     </w:rPr>
                   </w:pPr>
+                </w:p>
+              </w:tc>
+              <w:tc>
+                <w:tcPr>
+                  <w:tcW w:w="1428" w:type="dxa"/>
+                </w:tcPr>
+                <w:p>
+                  <w:pPr>
+                    <w:jc w:val="both"/>
+                    <w:rPr>
+                      <w:color w:val="000000" w:themeColor="text1"/>
+                      <w:sz w:val="18"/>
+                      <w:szCs w:val="18"/>
+                    </w:rPr>
+                  </w:pPr>
                   <w:r>
                     <w:rPr>
-                      <w:noProof/>
-                      <w:color w:val="000000" w:themeColor="text1"/>
-                      <w:sz w:val="24"/>
-                      <w:szCs w:val="24"/>
-                    </w:rPr>
-                    <w:drawing>
-                      <wp:inline distT="0" distB="0" distL="0" distR="0" wp14:anchorId="037B597D" wp14:editId="2E24B37A">
-                        <wp:extent cx="1137920" cy="1471612"/>
-                        <wp:effectExtent l="0" t="0" r="5080" b="0"/>
-                        <wp:docPr id="48" name="Imagen 48"/>
-                        <wp:cNvGraphicFramePr>
-                          <a:graphicFrameLocks xmlns:a="http://schemas.openxmlformats.org/drawingml/2006/main" noChangeAspect="1"/>
-                        </wp:cNvGraphicFramePr>
-                        <a:graphic xmlns:a="http://schemas.openxmlformats.org/drawingml/2006/main">
-                          <a:graphicData uri="http://schemas.openxmlformats.org/drawingml/2006/picture">
-                            <pic:pic xmlns:pic="http://schemas.openxmlformats.org/drawingml/2006/picture">
-                              <pic:nvPicPr>
-                                <pic:cNvPr id="1" name=""/>
-                                <pic:cNvPicPr/>
-                              </pic:nvPicPr>
-                              <pic:blipFill>
-                                <a:blip r:embed="rId48"/>
-                                <a:stretch>
-                                  <a:fillRect/>
-                                </a:stretch>
-                              </pic:blipFill>
-                              <pic:spPr>
-                                <a:xfrm>
-                                  <a:off x="0" y="0"/>
-                                  <a:ext cx="1141504" cy="1476247"/>
-                                </a:xfrm>
-                                <a:prstGeom prst="rect">
-                                  <a:avLst/>
-                                </a:prstGeom>
-                              </pic:spPr>
-                            </pic:pic>
-                          </a:graphicData>
-                        </a:graphic>
-                      </wp:inline>
-                    </w:drawing>
+                      <w:color w:val="000000" w:themeColor="text1"/>
+                      <w:sz w:val="18"/>
+                      <w:szCs w:val="18"/>
+                    </w:rPr>
+                    <w:t>(0, 0, 0)</w:t>
                   </w:r>
                 </w:p>
               </w:tc>
               <w:tc>
                 <w:tcPr>
-                  <w:tcW w:w="1223" w:type="dxa"/>
+                  <w:tcW w:w="631" w:type="dxa"/>
                 </w:tcPr>
                 <w:p>
                   <w:pPr>
                     <w:jc w:val="both"/>
                     <w:rPr>
                       <w:color w:val="000000" w:themeColor="text1"/>
-                      <w:sz w:val="22"/>
-                      <w:szCs w:val="22"/>
+                      <w:sz w:val="18"/>
+                      <w:szCs w:val="18"/>
                     </w:rPr>
                   </w:pPr>
                   <w:r>
                     <w:rPr>
                       <w:color w:val="000000" w:themeColor="text1"/>
-                      <w:sz w:val="22"/>
-                      <w:szCs w:val="22"/>
-                    </w:rPr>
-                    <w:t>#000000</w:t>
+                      <w:sz w:val="18"/>
+                      <w:szCs w:val="18"/>
+                    </w:rPr>
+                    <w:t>43%</w:t>
                   </w:r>
                 </w:p>
               </w:tc>
               <w:tc>
                 <w:tcPr>
-                  <w:tcW w:w="1039" w:type="dxa"/>
+                  <w:tcW w:w="2106" w:type="dxa"/>
+                  <w:gridSpan w:val="2"/>
+                  <w:vMerge/>
                 </w:tcPr>
                 <w:p>
                   <w:pPr>
                     <w:jc w:val="both"/>
                     <w:rPr>
                       <w:color w:val="000000" w:themeColor="text1"/>
-                      <w:sz w:val="22"/>
-                      <w:szCs w:val="22"/>
+                      <w:sz w:val="24"/>
+                      <w:szCs w:val="24"/>
+                    </w:rPr>
+                  </w:pPr>
+                </w:p>
+              </w:tc>
+              <w:tc>
+                <w:tcPr>
+                  <w:tcW w:w="1516" w:type="dxa"/>
+                </w:tcPr>
+                <w:p>
+                  <w:pPr>
+                    <w:jc w:val="both"/>
+                    <w:rPr>
+                      <w:color w:val="000000" w:themeColor="text1"/>
+                      <w:sz w:val="18"/>
+                      <w:szCs w:val="18"/>
                     </w:rPr>
                   </w:pPr>
                   <w:r>
                     <w:rPr>
                       <w:color w:val="000000" w:themeColor="text1"/>
-                      <w:sz w:val="22"/>
-                      <w:szCs w:val="22"/>
-                    </w:rPr>
-                    <w:t>40</w:t>
+                      <w:sz w:val="18"/>
+                      <w:szCs w:val="18"/>
+                    </w:rPr>
+                    <w:t>(100, 109, 104)</w:t>
+                  </w:r>
+                </w:p>
+              </w:tc>
+              <w:tc>
+                <w:tcPr>
+                  <w:tcW w:w="668" w:type="dxa"/>
+                </w:tcPr>
+                <w:p>
+                  <w:pPr>
+                    <w:jc w:val="both"/>
+                    <w:rPr>
+                      <w:color w:val="000000" w:themeColor="text1"/>
+                      <w:sz w:val="18"/>
+                      <w:szCs w:val="18"/>
+                    </w:rPr>
+                  </w:pPr>
+                  <w:r>
+                    <w:rPr>
+                      <w:color w:val="000000" w:themeColor="text1"/>
+                      <w:sz w:val="18"/>
+                      <w:szCs w:val="18"/>
+                    </w:rPr>
+                    <w:t>10</w:t>
                   </w:r>
                   <w:r>
                     <w:rPr>
                       <w:color w:val="000000" w:themeColor="text1"/>
-                      <w:sz w:val="22"/>
-                      <w:szCs w:val="22"/>
+                      <w:sz w:val="18"/>
+                      <w:szCs w:val="18"/>
                     </w:rPr>
                     <w:t>%</w:t>
                   </w:r>
@@ -10878,11 +11272,13 @@
             </w:tr>
             <w:tr>
               <w:trPr>
-                <w:trHeight w:val="607"/>
+                <w:gridAfter w:val="1"/>
+                <w:wAfter w:w="13" w:type="dxa"/>
+                <w:trHeight w:val="598"/>
               </w:trPr>
               <w:tc>
                 <w:tcPr>
-                  <w:tcW w:w="2127" w:type="dxa"/>
+                  <w:tcW w:w="2136" w:type="dxa"/>
                   <w:vMerge/>
                 </w:tcPr>
                 <w:p>
@@ -10898,61 +11294,74 @@
               </w:tc>
               <w:tc>
                 <w:tcPr>
-                  <w:tcW w:w="1275" w:type="dxa"/>
+                  <w:tcW w:w="1428" w:type="dxa"/>
                 </w:tcPr>
                 <w:p>
                   <w:pPr>
                     <w:jc w:val="both"/>
                     <w:rPr>
                       <w:color w:val="000000" w:themeColor="text1"/>
-                      <w:sz w:val="22"/>
-                      <w:szCs w:val="22"/>
+                      <w:sz w:val="18"/>
+                      <w:szCs w:val="18"/>
+                    </w:rPr>
+                  </w:pPr>
+                </w:p>
+                <w:p>
+                  <w:pPr>
+                    <w:jc w:val="both"/>
+                    <w:rPr>
+                      <w:color w:val="000000" w:themeColor="text1"/>
+                      <w:sz w:val="18"/>
+                      <w:szCs w:val="18"/>
                     </w:rPr>
                   </w:pPr>
                   <w:r>
                     <w:rPr>
                       <w:color w:val="000000" w:themeColor="text1"/>
-                      <w:sz w:val="22"/>
-                      <w:szCs w:val="22"/>
-                    </w:rPr>
-                    <w:t>#60a900</w:t>
+                      <w:sz w:val="18"/>
+                      <w:szCs w:val="18"/>
+                    </w:rPr>
+                    <w:t>(255, 255, 1)</w:t>
                   </w:r>
                 </w:p>
               </w:tc>
               <w:tc>
                 <w:tcPr>
-                  <w:tcW w:w="851" w:type="dxa"/>
+                  <w:tcW w:w="631" w:type="dxa"/>
                 </w:tcPr>
                 <w:p>
                   <w:pPr>
                     <w:jc w:val="both"/>
                     <w:rPr>
                       <w:color w:val="000000" w:themeColor="text1"/>
-                      <w:sz w:val="22"/>
-                      <w:szCs w:val="22"/>
+                      <w:sz w:val="18"/>
+                      <w:szCs w:val="18"/>
+                    </w:rPr>
+                  </w:pPr>
+                </w:p>
+                <w:p>
+                  <w:pPr>
+                    <w:jc w:val="both"/>
+                    <w:rPr>
+                      <w:color w:val="000000" w:themeColor="text1"/>
+                      <w:sz w:val="18"/>
+                      <w:szCs w:val="18"/>
                     </w:rPr>
                   </w:pPr>
                   <w:r>
                     <w:rPr>
                       <w:color w:val="000000" w:themeColor="text1"/>
-                      <w:sz w:val="22"/>
-                      <w:szCs w:val="22"/>
-                    </w:rPr>
-                    <w:t>20</w:t>
-                  </w:r>
-                  <w:r>
-                    <w:rPr>
-                      <w:color w:val="000000" w:themeColor="text1"/>
-                      <w:sz w:val="22"/>
-                      <w:szCs w:val="22"/>
-                    </w:rPr>
-                    <w:t>%</w:t>
+                      <w:sz w:val="18"/>
+                      <w:szCs w:val="18"/>
+                    </w:rPr>
+                    <w:t>14%</w:t>
                   </w:r>
                 </w:p>
               </w:tc>
               <w:tc>
                 <w:tcPr>
-                  <w:tcW w:w="1984" w:type="dxa"/>
+                  <w:tcW w:w="2106" w:type="dxa"/>
+                  <w:gridSpan w:val="2"/>
                   <w:vMerge/>
                 </w:tcPr>
                 <w:p>
@@ -10968,53 +11377,61 @@
               </w:tc>
               <w:tc>
                 <w:tcPr>
-                  <w:tcW w:w="1223" w:type="dxa"/>
+                  <w:tcW w:w="1516" w:type="dxa"/>
                 </w:tcPr>
                 <w:p>
                   <w:pPr>
                     <w:jc w:val="both"/>
                     <w:rPr>
                       <w:color w:val="000000" w:themeColor="text1"/>
-                      <w:sz w:val="22"/>
-                      <w:szCs w:val="22"/>
+                      <w:sz w:val="18"/>
+                      <w:szCs w:val="18"/>
                     </w:rPr>
                   </w:pPr>
                   <w:r>
                     <w:rPr>
                       <w:color w:val="000000" w:themeColor="text1"/>
-                      <w:sz w:val="22"/>
-                      <w:szCs w:val="22"/>
-                    </w:rPr>
-                    <w:t>#ffff01</w:t>
+                      <w:sz w:val="18"/>
+                      <w:szCs w:val="18"/>
+                    </w:rPr>
+                    <w:t>(0, 0, 0)</w:t>
                   </w:r>
                 </w:p>
               </w:tc>
               <w:tc>
                 <w:tcPr>
-                  <w:tcW w:w="1039" w:type="dxa"/>
+                  <w:tcW w:w="668" w:type="dxa"/>
                 </w:tcPr>
                 <w:p>
                   <w:pPr>
                     <w:jc w:val="both"/>
                     <w:rPr>
                       <w:color w:val="000000" w:themeColor="text1"/>
-                      <w:sz w:val="22"/>
-                      <w:szCs w:val="22"/>
+                      <w:sz w:val="18"/>
+                      <w:szCs w:val="18"/>
                     </w:rPr>
                   </w:pPr>
                   <w:r>
                     <w:rPr>
                       <w:color w:val="000000" w:themeColor="text1"/>
-                      <w:sz w:val="22"/>
-                      <w:szCs w:val="22"/>
-                    </w:rPr>
-                    <w:t>35</w:t>
+                      <w:sz w:val="18"/>
+                      <w:szCs w:val="18"/>
+                    </w:rPr>
+                    <w:t>1</w:t>
                   </w:r>
                   <w:r>
                     <w:rPr>
                       <w:color w:val="000000" w:themeColor="text1"/>
-                      <w:sz w:val="22"/>
-                      <w:szCs w:val="22"/>
+                      <w:sz w:val="18"/>
+                      <w:szCs w:val="18"/>
+                    </w:rPr>
+                    <w:t>0</w:t>
+                  </w:r>
+                  <w:r>
+                    <w:rPr>
+                      <w:color w:val="000000" w:themeColor="text1"/>
+                      <w:sz w:val="18"/>
+                      <w:szCs w:val="18"/>
                     </w:rPr>
                     <w:t>%</w:t>
                   </w:r>
@@ -11022,246 +11439,10 @@
               </w:tc>
             </w:tr>
             <w:tr>
-              <w:trPr>
-                <w:trHeight w:val="294"/>
-              </w:trPr>
               <w:tc>
                 <w:tcPr>
-                  <w:tcW w:w="2127" w:type="dxa"/>
-                  <w:vMerge/>
-                </w:tcPr>
-                <w:p>
-                  <w:pPr>
-                    <w:jc w:val="both"/>
-                    <w:rPr>
-                      <w:color w:val="000000" w:themeColor="text1"/>
-                      <w:sz w:val="24"/>
-                      <w:szCs w:val="24"/>
-                    </w:rPr>
-                  </w:pPr>
-                </w:p>
-              </w:tc>
-              <w:tc>
-                <w:tcPr>
-                  <w:tcW w:w="1275" w:type="dxa"/>
-                </w:tcPr>
-                <w:p>
-                  <w:pPr>
-                    <w:jc w:val="both"/>
-                    <w:rPr>
-                      <w:color w:val="000000" w:themeColor="text1"/>
-                      <w:sz w:val="22"/>
-                      <w:szCs w:val="22"/>
-                    </w:rPr>
-                  </w:pPr>
-                  <w:r>
-                    <w:rPr>
-                      <w:color w:val="000000" w:themeColor="text1"/>
-                      <w:sz w:val="22"/>
-                      <w:szCs w:val="22"/>
-                    </w:rPr>
-                    <w:t>#63726c</w:t>
-                  </w:r>
-                </w:p>
-              </w:tc>
-              <w:tc>
-                <w:tcPr>
-                  <w:tcW w:w="851" w:type="dxa"/>
-                </w:tcPr>
-                <w:p>
-                  <w:pPr>
-                    <w:jc w:val="both"/>
-                    <w:rPr>
-                      <w:color w:val="000000" w:themeColor="text1"/>
-                      <w:sz w:val="22"/>
-                      <w:szCs w:val="22"/>
-                    </w:rPr>
-                  </w:pPr>
-                  <w:r>
-                    <w:rPr>
-                      <w:color w:val="000000" w:themeColor="text1"/>
-                      <w:sz w:val="22"/>
-                      <w:szCs w:val="22"/>
-                    </w:rPr>
-                    <w:t>15%</w:t>
-                  </w:r>
-                </w:p>
-              </w:tc>
-              <w:tc>
-                <w:tcPr>
-                  <w:tcW w:w="1984" w:type="dxa"/>
-                  <w:vMerge/>
-                </w:tcPr>
-                <w:p>
-                  <w:pPr>
-                    <w:jc w:val="both"/>
-                    <w:rPr>
-                      <w:color w:val="000000" w:themeColor="text1"/>
-                      <w:sz w:val="24"/>
-                      <w:szCs w:val="24"/>
-                    </w:rPr>
-                  </w:pPr>
-                </w:p>
-              </w:tc>
-              <w:tc>
-                <w:tcPr>
-                  <w:tcW w:w="1223" w:type="dxa"/>
-                  <w:vMerge w:val="restart"/>
-                </w:tcPr>
-                <w:p>
-                  <w:pPr>
-                    <w:jc w:val="both"/>
-                    <w:rPr>
-                      <w:color w:val="000000" w:themeColor="text1"/>
-                      <w:sz w:val="22"/>
-                      <w:szCs w:val="22"/>
-                    </w:rPr>
-                  </w:pPr>
-                  <w:r>
-                    <w:rPr>
-                      <w:color w:val="000000" w:themeColor="text1"/>
-                      <w:sz w:val="22"/>
-                      <w:szCs w:val="22"/>
-                    </w:rPr>
-                    <w:t>#1b095b</w:t>
-                  </w:r>
-                </w:p>
-              </w:tc>
-              <w:tc>
-                <w:tcPr>
-                  <w:tcW w:w="1039" w:type="dxa"/>
-                  <w:vMerge w:val="restart"/>
-                </w:tcPr>
-                <w:p>
-                  <w:pPr>
-                    <w:jc w:val="both"/>
-                    <w:rPr>
-                      <w:color w:val="000000" w:themeColor="text1"/>
-                      <w:sz w:val="22"/>
-                      <w:szCs w:val="22"/>
-                    </w:rPr>
-                  </w:pPr>
-                  <w:r>
-                    <w:rPr>
-                      <w:color w:val="000000" w:themeColor="text1"/>
-                      <w:sz w:val="22"/>
-                      <w:szCs w:val="22"/>
-                    </w:rPr>
-                    <w:t>25</w:t>
-                  </w:r>
-                  <w:r>
-                    <w:rPr>
-                      <w:color w:val="000000" w:themeColor="text1"/>
-                      <w:sz w:val="22"/>
-                      <w:szCs w:val="22"/>
-                    </w:rPr>
-                    <w:t>%</w:t>
-                  </w:r>
-                </w:p>
-              </w:tc>
-            </w:tr>
-            <w:tr>
-              <w:trPr>
-                <w:trHeight w:val="294"/>
-              </w:trPr>
-              <w:tc>
-                <w:tcPr>
-                  <w:tcW w:w="2127" w:type="dxa"/>
-                  <w:vMerge/>
-                </w:tcPr>
-                <w:p>
-                  <w:pPr>
-                    <w:jc w:val="both"/>
-                    <w:rPr>
-                      <w:color w:val="000000" w:themeColor="text1"/>
-                      <w:sz w:val="24"/>
-                      <w:szCs w:val="24"/>
-                    </w:rPr>
-                  </w:pPr>
-                </w:p>
-              </w:tc>
-              <w:tc>
-                <w:tcPr>
-                  <w:tcW w:w="1275" w:type="dxa"/>
-                </w:tcPr>
-                <w:p>
-                  <w:pPr>
-                    <w:jc w:val="both"/>
-                    <w:rPr>
-                      <w:color w:val="000000" w:themeColor="text1"/>
-                      <w:sz w:val="22"/>
-                      <w:szCs w:val="22"/>
-                    </w:rPr>
-                  </w:pPr>
-                  <w:r>
-                    <w:rPr>
-                      <w:color w:val="000000" w:themeColor="text1"/>
-                      <w:sz w:val="22"/>
-                      <w:szCs w:val="22"/>
-                    </w:rPr>
-                    <w:t>#000000</w:t>
-                  </w:r>
-                </w:p>
-              </w:tc>
-              <w:tc>
-                <w:tcPr>
-                  <w:tcW w:w="851" w:type="dxa"/>
-                </w:tcPr>
-                <w:p>
-                  <w:pPr>
-                    <w:jc w:val="both"/>
-                    <w:rPr>
-                      <w:color w:val="000000" w:themeColor="text1"/>
-                      <w:sz w:val="22"/>
-                      <w:szCs w:val="22"/>
-                    </w:rPr>
-                  </w:pPr>
-                  <w:r>
-                    <w:rPr>
-                      <w:color w:val="000000" w:themeColor="text1"/>
-                      <w:sz w:val="22"/>
-                      <w:szCs w:val="22"/>
-                    </w:rPr>
-                    <w:t>10%</w:t>
-                  </w:r>
-                </w:p>
-              </w:tc>
-              <w:tc>
-                <w:tcPr>
-                  <w:tcW w:w="1984" w:type="dxa"/>
-                  <w:vMerge/>
-                </w:tcPr>
-                <w:p>
-                  <w:pPr>
-                    <w:jc w:val="both"/>
-                    <w:rPr>
-                      <w:color w:val="000000" w:themeColor="text1"/>
-                      <w:sz w:val="24"/>
-                      <w:szCs w:val="24"/>
-                    </w:rPr>
-                  </w:pPr>
-                </w:p>
-              </w:tc>
-              <w:tc>
-                <w:tcPr>
-                  <w:tcW w:w="1223" w:type="dxa"/>
-                  <w:vMerge/>
-                </w:tcPr>
-                <w:p>
-                  <w:pPr>
-                    <w:jc w:val="both"/>
-                    <w:rPr>
-                      <w:color w:val="000000" w:themeColor="text1"/>
-                      <w:sz w:val="24"/>
-                      <w:szCs w:val="24"/>
-                    </w:rPr>
-                  </w:pPr>
-                </w:p>
-              </w:tc>
-              <w:tc>
-                <w:tcPr>
-                  <w:tcW w:w="1039" w:type="dxa"/>
-                  <w:vMerge/>
+                  <w:tcW w:w="8498" w:type="dxa"/>
+                  <w:gridSpan w:val="8"/>
                 </w:tcPr>
                 <w:p>
                   <w:pPr>
@@ -11278,26 +11459,8 @@
             <w:tr>
               <w:tc>
                 <w:tcPr>
-                  <w:tcW w:w="8499" w:type="dxa"/>
-                  <w:gridSpan w:val="6"/>
-                </w:tcPr>
-                <w:p>
-                  <w:pPr>
-                    <w:jc w:val="both"/>
-                    <w:rPr>
-                      <w:color w:val="000000" w:themeColor="text1"/>
-                      <w:sz w:val="24"/>
-                      <w:szCs w:val="24"/>
-                    </w:rPr>
-                  </w:pPr>
-                </w:p>
-              </w:tc>
-            </w:tr>
-            <w:tr>
-              <w:tc>
-                <w:tcPr>
-                  <w:tcW w:w="4253" w:type="dxa"/>
-                  <w:gridSpan w:val="3"/>
+                  <w:tcW w:w="4201" w:type="dxa"/>
+                  <w:gridSpan w:val="4"/>
                   <w:vAlign w:val="center"/>
                 </w:tcPr>
                 <w:p>
@@ -11317,14 +11480,14 @@
                       <w:sz w:val="32"/>
                       <w:szCs w:val="32"/>
                     </w:rPr>
-                    <w:t>Cortesía</w:t>
+                    <w:t>Artificial</w:t>
                   </w:r>
                 </w:p>
               </w:tc>
               <w:tc>
                 <w:tcPr>
-                  <w:tcW w:w="4246" w:type="dxa"/>
-                  <w:gridSpan w:val="3"/>
+                  <w:tcW w:w="4297" w:type="dxa"/>
+                  <w:gridSpan w:val="4"/>
                   <w:vAlign w:val="center"/>
                 </w:tcPr>
                 <w:p>
@@ -11344,18 +11507,20 @@
                       <w:sz w:val="32"/>
                       <w:szCs w:val="32"/>
                     </w:rPr>
-                    <w:t>Feo</w:t>
+                    <w:t>Verdad</w:t>
                   </w:r>
                 </w:p>
               </w:tc>
             </w:tr>
             <w:tr>
               <w:trPr>
+                <w:gridAfter w:val="1"/>
+                <w:wAfter w:w="13" w:type="dxa"/>
                 <w:trHeight w:val="1011"/>
               </w:trPr>
               <w:tc>
                 <w:tcPr>
-                  <w:tcW w:w="2127" w:type="dxa"/>
+                  <w:tcW w:w="2136" w:type="dxa"/>
                   <w:vMerge w:val="restart"/>
                 </w:tcPr>
                 <w:p>
@@ -11369,16 +11534,15 @@
                   </w:pPr>
                   <w:r>
                     <w:rPr>
-                      <w:noProof/>
                       <w:color w:val="000000" w:themeColor="text1"/>
                       <w:sz w:val="24"/>
                       <w:szCs w:val="24"/>
                     </w:rPr>
                     <w:drawing>
-                      <wp:inline distT="0" distB="0" distL="0" distR="0" wp14:anchorId="51062975" wp14:editId="74715B0C">
-                        <wp:extent cx="1219835" cy="1585913"/>
-                        <wp:effectExtent l="0" t="0" r="0" b="0"/>
-                        <wp:docPr id="49" name="Imagen 49"/>
+                      <wp:inline distT="0" distB="0" distL="0" distR="0" wp14:anchorId="74299644" wp14:editId="35D33930">
+                        <wp:extent cx="1204912" cy="1610199"/>
+                        <wp:effectExtent l="0" t="0" r="0" b="9525"/>
+                        <wp:docPr id="12" name="Imagen 12"/>
                         <wp:cNvGraphicFramePr>
                           <a:graphicFrameLocks xmlns:a="http://schemas.openxmlformats.org/drawingml/2006/main" noChangeAspect="1"/>
                         </wp:cNvGraphicFramePr>
@@ -11396,9 +11560,9 @@
                                 </a:stretch>
                               </pic:blipFill>
                               <pic:spPr>
-                                <a:xfrm flipH="1">
+                                <a:xfrm>
                                   <a:off x="0" y="0"/>
-                                  <a:ext cx="1235887" cy="1606782"/>
+                                  <a:ext cx="1207978" cy="1614296"/>
                                 </a:xfrm>
                                 <a:prstGeom prst="rect">
                                   <a:avLst/>
@@ -11414,61 +11578,54 @@
               </w:tc>
               <w:tc>
                 <w:tcPr>
-                  <w:tcW w:w="1275" w:type="dxa"/>
+                  <w:tcW w:w="1428" w:type="dxa"/>
                 </w:tcPr>
                 <w:p>
                   <w:pPr>
                     <w:jc w:val="both"/>
                     <w:rPr>
                       <w:color w:val="000000" w:themeColor="text1"/>
-                      <w:sz w:val="22"/>
-                      <w:szCs w:val="22"/>
+                      <w:sz w:val="18"/>
+                      <w:szCs w:val="18"/>
                     </w:rPr>
                   </w:pPr>
                   <w:r>
                     <w:rPr>
                       <w:color w:val="000000" w:themeColor="text1"/>
-                      <w:sz w:val="22"/>
-                      <w:szCs w:val="22"/>
-                    </w:rPr>
-                    <w:t>#ffc1e8</w:t>
+                      <w:sz w:val="18"/>
+                      <w:szCs w:val="18"/>
+                    </w:rPr>
+                    <w:t>(48, 33, 131)</w:t>
                   </w:r>
                 </w:p>
               </w:tc>
               <w:tc>
                 <w:tcPr>
-                  <w:tcW w:w="851" w:type="dxa"/>
+                  <w:tcW w:w="631" w:type="dxa"/>
                 </w:tcPr>
                 <w:p>
                   <w:pPr>
                     <w:jc w:val="both"/>
                     <w:rPr>
                       <w:color w:val="000000" w:themeColor="text1"/>
-                      <w:sz w:val="22"/>
-                      <w:szCs w:val="22"/>
+                      <w:sz w:val="18"/>
+                      <w:szCs w:val="18"/>
                     </w:rPr>
                   </w:pPr>
                   <w:r>
                     <w:rPr>
                       <w:color w:val="000000" w:themeColor="text1"/>
-                      <w:sz w:val="22"/>
-                      <w:szCs w:val="22"/>
-                    </w:rPr>
-                    <w:t>22</w:t>
-                  </w:r>
-                  <w:r>
-                    <w:rPr>
-                      <w:color w:val="000000" w:themeColor="text1"/>
-                      <w:sz w:val="22"/>
-                      <w:szCs w:val="22"/>
-                    </w:rPr>
-                    <w:t>%</w:t>
+                      <w:sz w:val="18"/>
+                      <w:szCs w:val="18"/>
+                    </w:rPr>
+                    <w:t>22%</w:t>
                   </w:r>
                 </w:p>
               </w:tc>
               <w:tc>
                 <w:tcPr>
-                  <w:tcW w:w="1984" w:type="dxa"/>
+                  <w:tcW w:w="2106" w:type="dxa"/>
+                  <w:gridSpan w:val="2"/>
                   <w:vMerge w:val="restart"/>
                 </w:tcPr>
                 <w:p>
@@ -11482,16 +11639,15 @@
                   </w:pPr>
                   <w:r>
                     <w:rPr>
-                      <w:noProof/>
                       <w:color w:val="000000" w:themeColor="text1"/>
                       <w:sz w:val="24"/>
                       <w:szCs w:val="24"/>
                     </w:rPr>
                     <w:drawing>
-                      <wp:inline distT="0" distB="0" distL="0" distR="0" wp14:anchorId="3BBECAA1" wp14:editId="2170524A">
-                        <wp:extent cx="1109663" cy="1581646"/>
-                        <wp:effectExtent l="0" t="0" r="0" b="0"/>
-                        <wp:docPr id="50" name="Imagen 50"/>
+                      <wp:inline distT="0" distB="0" distL="0" distR="0" wp14:anchorId="4D4BAB12" wp14:editId="615D0C4D">
+                        <wp:extent cx="1199871" cy="1585912"/>
+                        <wp:effectExtent l="0" t="0" r="635" b="0"/>
+                        <wp:docPr id="54" name="Imagen 54"/>
                         <wp:cNvGraphicFramePr>
                           <a:graphicFrameLocks xmlns:a="http://schemas.openxmlformats.org/drawingml/2006/main" noChangeAspect="1"/>
                         </wp:cNvGraphicFramePr>
@@ -11502,20 +11658,27 @@
                                 <pic:cNvPr id="1" name=""/>
                                 <pic:cNvPicPr/>
                               </pic:nvPicPr>
-                              <pic:blipFill>
+                              <pic:blipFill rotWithShape="1">
                                 <a:blip r:embed="rId50"/>
-                                <a:stretch>
-                                  <a:fillRect/>
-                                </a:stretch>
+                                <a:srcRect r="2098"/>
+                                <a:stretch/>
                               </pic:blipFill>
-                              <pic:spPr>
+                              <pic:spPr bwMode="auto">
                                 <a:xfrm>
                                   <a:off x="0" y="0"/>
-                                  <a:ext cx="1115016" cy="1589276"/>
+                                  <a:ext cx="1204891" cy="1592548"/>
                                 </a:xfrm>
                                 <a:prstGeom prst="rect">
                                   <a:avLst/>
                                 </a:prstGeom>
+                                <a:ln>
+                                  <a:noFill/>
+                                </a:ln>
+                                <a:extLst>
+                                  <a:ext uri="{53640926-AAD7-44D8-BBD7-CCE9431645EC}">
+                                    <a14:shadowObscured xmlns:a14="http://schemas.microsoft.com/office/drawing/2010/main"/>
+                                  </a:ext>
+                                </a:extLst>
                               </pic:spPr>
                             </pic:pic>
                           </a:graphicData>
@@ -11527,13 +11690,23 @@
               </w:tc>
               <w:tc>
                 <w:tcPr>
-                  <w:tcW w:w="1223" w:type="dxa"/>
+                  <w:tcW w:w="1516" w:type="dxa"/>
                 </w:tcPr>
                 <w:p>
                   <w:pPr>
                     <w:jc w:val="both"/>
                     <w:rPr>
                       <w:color w:val="000000" w:themeColor="text1"/>
+                      <w:sz w:val="18"/>
+                      <w:szCs w:val="18"/>
+                    </w:rPr>
+                  </w:pPr>
+                </w:p>
+                <w:p>
+                  <w:pPr>
+                    <w:jc w:val="both"/>
+                    <w:rPr>
+                      <w:color w:val="000000" w:themeColor="text1"/>
                       <w:sz w:val="22"/>
                       <w:szCs w:val="22"/>
                     </w:rPr>
@@ -11541,22 +11714,32 @@
                   <w:r>
                     <w:rPr>
                       <w:color w:val="000000" w:themeColor="text1"/>
-                      <w:sz w:val="22"/>
-                      <w:szCs w:val="22"/>
-                    </w:rPr>
-                    <w:t>#672e01</w:t>
+                      <w:sz w:val="18"/>
+                      <w:szCs w:val="18"/>
+                    </w:rPr>
+                    <w:t>(255, 255, 255)</w:t>
                   </w:r>
                 </w:p>
               </w:tc>
               <w:tc>
                 <w:tcPr>
-                  <w:tcW w:w="1039" w:type="dxa"/>
+                  <w:tcW w:w="668" w:type="dxa"/>
                 </w:tcPr>
                 <w:p>
                   <w:pPr>
                     <w:jc w:val="both"/>
                     <w:rPr>
                       <w:color w:val="000000" w:themeColor="text1"/>
+                      <w:sz w:val="18"/>
+                      <w:szCs w:val="18"/>
+                    </w:rPr>
+                  </w:pPr>
+                </w:p>
+                <w:p>
+                  <w:pPr>
+                    <w:jc w:val="both"/>
+                    <w:rPr>
+                      <w:color w:val="000000" w:themeColor="text1"/>
                       <w:sz w:val="22"/>
                       <w:szCs w:val="22"/>
                     </w:rPr>
@@ -11564,16 +11747,16 @@
                   <w:r>
                     <w:rPr>
                       <w:color w:val="000000" w:themeColor="text1"/>
-                      <w:sz w:val="22"/>
-                      <w:szCs w:val="22"/>
-                    </w:rPr>
-                    <w:t>32</w:t>
+                      <w:sz w:val="18"/>
+                      <w:szCs w:val="18"/>
+                    </w:rPr>
+                    <w:t>40</w:t>
                   </w:r>
                   <w:r>
                     <w:rPr>
                       <w:color w:val="000000" w:themeColor="text1"/>
-                      <w:sz w:val="22"/>
-                      <w:szCs w:val="22"/>
+                      <w:sz w:val="18"/>
+                      <w:szCs w:val="18"/>
                     </w:rPr>
                     <w:t>%</w:t>
                   </w:r>
@@ -11582,11 +11765,13 @@
             </w:tr>
             <w:tr>
               <w:trPr>
+                <w:gridAfter w:val="1"/>
+                <w:wAfter w:w="13" w:type="dxa"/>
                 <w:trHeight w:val="607"/>
               </w:trPr>
               <w:tc>
                 <w:tcPr>
-                  <w:tcW w:w="2127" w:type="dxa"/>
+                  <w:tcW w:w="2136" w:type="dxa"/>
                   <w:vMerge/>
                 </w:tcPr>
                 <w:p>
@@ -11602,61 +11787,54 @@
               </w:tc>
               <w:tc>
                 <w:tcPr>
-                  <w:tcW w:w="1275" w:type="dxa"/>
+                  <w:tcW w:w="1428" w:type="dxa"/>
                 </w:tcPr>
                 <w:p>
                   <w:pPr>
                     <w:jc w:val="both"/>
                     <w:rPr>
                       <w:color w:val="000000" w:themeColor="text1"/>
-                      <w:sz w:val="22"/>
-                      <w:szCs w:val="22"/>
+                      <w:sz w:val="18"/>
+                      <w:szCs w:val="18"/>
                     </w:rPr>
                   </w:pPr>
                   <w:r>
                     <w:rPr>
                       <w:color w:val="000000" w:themeColor="text1"/>
-                      <w:sz w:val="22"/>
-                      <w:szCs w:val="22"/>
-                    </w:rPr>
-                    <w:t>#6d8492</w:t>
+                      <w:sz w:val="18"/>
+                      <w:szCs w:val="18"/>
+                    </w:rPr>
+                    <w:t>(134, 149, 159)</w:t>
                   </w:r>
                 </w:p>
               </w:tc>
               <w:tc>
                 <w:tcPr>
-                  <w:tcW w:w="851" w:type="dxa"/>
+                  <w:tcW w:w="631" w:type="dxa"/>
                 </w:tcPr>
                 <w:p>
                   <w:pPr>
                     <w:jc w:val="both"/>
                     <w:rPr>
                       <w:color w:val="000000" w:themeColor="text1"/>
-                      <w:sz w:val="22"/>
-                      <w:szCs w:val="22"/>
+                      <w:sz w:val="18"/>
+                      <w:szCs w:val="18"/>
                     </w:rPr>
                   </w:pPr>
                   <w:r>
                     <w:rPr>
                       <w:color w:val="000000" w:themeColor="text1"/>
-                      <w:sz w:val="22"/>
-                      <w:szCs w:val="22"/>
-                    </w:rPr>
-                    <w:t>22</w:t>
-                  </w:r>
-                  <w:r>
-                    <w:rPr>
-                      <w:color w:val="000000" w:themeColor="text1"/>
-                      <w:sz w:val="22"/>
-                      <w:szCs w:val="22"/>
-                    </w:rPr>
-                    <w:t>%</w:t>
+                      <w:sz w:val="18"/>
+                      <w:szCs w:val="18"/>
+                    </w:rPr>
+                    <w:t>22%</w:t>
                   </w:r>
                 </w:p>
               </w:tc>
               <w:tc>
                 <w:tcPr>
-                  <w:tcW w:w="1984" w:type="dxa"/>
+                  <w:tcW w:w="2106" w:type="dxa"/>
+                  <w:gridSpan w:val="2"/>
                   <w:vMerge/>
                 </w:tcPr>
                 <w:p>
@@ -11672,53 +11850,53 @@
               </w:tc>
               <w:tc>
                 <w:tcPr>
-                  <w:tcW w:w="1223" w:type="dxa"/>
+                  <w:tcW w:w="1516" w:type="dxa"/>
                 </w:tcPr>
                 <w:p>
                   <w:pPr>
                     <w:jc w:val="both"/>
                     <w:rPr>
                       <w:color w:val="000000" w:themeColor="text1"/>
-                      <w:sz w:val="22"/>
-                      <w:szCs w:val="22"/>
+                      <w:sz w:val="18"/>
+                      <w:szCs w:val="18"/>
                     </w:rPr>
                   </w:pPr>
                   <w:r>
                     <w:rPr>
                       <w:color w:val="000000" w:themeColor="text1"/>
-                      <w:sz w:val="22"/>
-                      <w:szCs w:val="22"/>
-                    </w:rPr>
-                    <w:t>#5a6662</w:t>
+                      <w:sz w:val="18"/>
+                      <w:szCs w:val="18"/>
+                    </w:rPr>
+                    <w:t>(1, 71, 195)</w:t>
                   </w:r>
                 </w:p>
               </w:tc>
               <w:tc>
                 <w:tcPr>
-                  <w:tcW w:w="1039" w:type="dxa"/>
+                  <w:tcW w:w="668" w:type="dxa"/>
                 </w:tcPr>
                 <w:p>
                   <w:pPr>
                     <w:jc w:val="both"/>
                     <w:rPr>
                       <w:color w:val="000000" w:themeColor="text1"/>
-                      <w:sz w:val="22"/>
-                      <w:szCs w:val="22"/>
+                      <w:sz w:val="18"/>
+                      <w:szCs w:val="18"/>
                     </w:rPr>
                   </w:pPr>
                   <w:r>
                     <w:rPr>
                       <w:color w:val="000000" w:themeColor="text1"/>
-                      <w:sz w:val="22"/>
-                      <w:szCs w:val="22"/>
-                    </w:rPr>
-                    <w:t>32</w:t>
+                      <w:sz w:val="18"/>
+                      <w:szCs w:val="18"/>
+                    </w:rPr>
+                    <w:t>35</w:t>
                   </w:r>
                   <w:r>
                     <w:rPr>
                       <w:color w:val="000000" w:themeColor="text1"/>
-                      <w:sz w:val="22"/>
-                      <w:szCs w:val="22"/>
+                      <w:sz w:val="18"/>
+                      <w:szCs w:val="18"/>
                     </w:rPr>
                     <w:t>%</w:t>
                   </w:r>
@@ -11727,11 +11905,13 @@
             </w:tr>
             <w:tr>
               <w:trPr>
+                <w:gridAfter w:val="1"/>
+                <w:wAfter w:w="13" w:type="dxa"/>
                 <w:trHeight w:val="294"/>
               </w:trPr>
               <w:tc>
                 <w:tcPr>
-                  <w:tcW w:w="2127" w:type="dxa"/>
+                  <w:tcW w:w="2136" w:type="dxa"/>
                   <w:vMerge/>
                 </w:tcPr>
                 <w:p>
@@ -11747,45 +11927,45 @@
               </w:tc>
               <w:tc>
                 <w:tcPr>
-                  <w:tcW w:w="1275" w:type="dxa"/>
+                  <w:tcW w:w="1428" w:type="dxa"/>
                 </w:tcPr>
                 <w:p>
                   <w:pPr>
                     <w:jc w:val="both"/>
                     <w:rPr>
                       <w:color w:val="000000" w:themeColor="text1"/>
-                      <w:sz w:val="22"/>
-                      <w:szCs w:val="22"/>
+                      <w:sz w:val="18"/>
+                      <w:szCs w:val="18"/>
                     </w:rPr>
                   </w:pPr>
                   <w:r>
                     <w:rPr>
                       <w:color w:val="000000" w:themeColor="text1"/>
-                      <w:sz w:val="22"/>
-                      <w:szCs w:val="22"/>
-                    </w:rPr>
-                    <w:t>#f8ffff</w:t>
+                      <w:sz w:val="18"/>
+                      <w:szCs w:val="18"/>
+                    </w:rPr>
+                    <w:t>(255, 203, 255)</w:t>
                   </w:r>
                 </w:p>
               </w:tc>
               <w:tc>
                 <w:tcPr>
-                  <w:tcW w:w="851" w:type="dxa"/>
+                  <w:tcW w:w="631" w:type="dxa"/>
                 </w:tcPr>
                 <w:p>
                   <w:pPr>
                     <w:jc w:val="both"/>
                     <w:rPr>
                       <w:color w:val="000000" w:themeColor="text1"/>
-                      <w:sz w:val="22"/>
-                      <w:szCs w:val="22"/>
+                      <w:sz w:val="18"/>
+                      <w:szCs w:val="18"/>
                     </w:rPr>
                   </w:pPr>
                   <w:r>
                     <w:rPr>
                       <w:color w:val="000000" w:themeColor="text1"/>
-                      <w:sz w:val="22"/>
-                      <w:szCs w:val="22"/>
+                      <w:sz w:val="18"/>
+                      <w:szCs w:val="18"/>
                     </w:rPr>
                     <w:t>20%</w:t>
                   </w:r>
@@ -11793,7 +11973,8 @@
               </w:tc>
               <w:tc>
                 <w:tcPr>
-                  <w:tcW w:w="1984" w:type="dxa"/>
+                  <w:tcW w:w="2106" w:type="dxa"/>
+                  <w:gridSpan w:val="2"/>
                   <w:vMerge/>
                 </w:tcPr>
                 <w:p>
@@ -11809,7 +11990,7 @@
               </w:tc>
               <w:tc>
                 <w:tcPr>
-                  <w:tcW w:w="1223" w:type="dxa"/>
+                  <w:tcW w:w="1516" w:type="dxa"/>
                   <w:vMerge w:val="restart"/>
                 </w:tcPr>
                 <w:p>
@@ -11817,23 +11998,49 @@
                     <w:jc w:val="both"/>
                     <w:rPr>
                       <w:color w:val="000000" w:themeColor="text1"/>
-                      <w:sz w:val="22"/>
-                      <w:szCs w:val="22"/>
+                      <w:sz w:val="18"/>
+                      <w:szCs w:val="18"/>
+                    </w:rPr>
+                  </w:pPr>
+                </w:p>
+                <w:p>
+                  <w:pPr>
+                    <w:jc w:val="both"/>
+                    <w:rPr>
+                      <w:color w:val="000000" w:themeColor="text1"/>
+                      <w:sz w:val="18"/>
+                      <w:szCs w:val="18"/>
                     </w:rPr>
                   </w:pPr>
                   <w:r>
                     <w:rPr>
                       <w:color w:val="000000" w:themeColor="text1"/>
-                      <w:sz w:val="22"/>
-                      <w:szCs w:val="22"/>
-                    </w:rPr>
-                    <w:t>#000000</w:t>
+                      <w:sz w:val="18"/>
+                      <w:szCs w:val="18"/>
+                    </w:rPr>
+                    <w:t>(</w:t>
+                  </w:r>
+                  <w:r>
+                    <w:rPr>
+                      <w:color w:val="000000" w:themeColor="text1"/>
+                      <w:sz w:val="18"/>
+                      <w:szCs w:val="18"/>
+                    </w:rPr>
+                    <w:t>199,159,52</w:t>
+                  </w:r>
+                  <w:r>
+                    <w:rPr>
+                      <w:color w:val="000000" w:themeColor="text1"/>
+                      <w:sz w:val="18"/>
+                      <w:szCs w:val="18"/>
+                    </w:rPr>
+                    <w:t>)</w:t>
                   </w:r>
                 </w:p>
               </w:tc>
               <w:tc>
                 <w:tcPr>
-                  <w:tcW w:w="1039" w:type="dxa"/>
+                  <w:tcW w:w="668" w:type="dxa"/>
                   <w:vMerge w:val="restart"/>
                 </w:tcPr>
                 <w:p>
@@ -11841,23 +12048,33 @@
                     <w:jc w:val="both"/>
                     <w:rPr>
                       <w:color w:val="000000" w:themeColor="text1"/>
-                      <w:sz w:val="22"/>
-                      <w:szCs w:val="22"/>
+                      <w:sz w:val="18"/>
+                      <w:szCs w:val="18"/>
+                    </w:rPr>
+                  </w:pPr>
+                </w:p>
+                <w:p>
+                  <w:pPr>
+                    <w:jc w:val="both"/>
+                    <w:rPr>
+                      <w:color w:val="000000" w:themeColor="text1"/>
+                      <w:sz w:val="18"/>
+                      <w:szCs w:val="18"/>
                     </w:rPr>
                   </w:pPr>
                   <w:r>
                     <w:rPr>
                       <w:color w:val="000000" w:themeColor="text1"/>
-                      <w:sz w:val="22"/>
-                      <w:szCs w:val="22"/>
-                    </w:rPr>
-                    <w:t>26</w:t>
+                      <w:sz w:val="18"/>
+                      <w:szCs w:val="18"/>
+                    </w:rPr>
+                    <w:t>25</w:t>
                   </w:r>
                   <w:r>
                     <w:rPr>
                       <w:color w:val="000000" w:themeColor="text1"/>
-                      <w:sz w:val="22"/>
-                      <w:szCs w:val="22"/>
+                      <w:sz w:val="18"/>
+                      <w:szCs w:val="18"/>
                     </w:rPr>
                     <w:t>%</w:t>
                   </w:r>
@@ -11866,11 +12083,13 @@
             </w:tr>
             <w:tr>
               <w:trPr>
+                <w:gridAfter w:val="1"/>
+                <w:wAfter w:w="13" w:type="dxa"/>
                 <w:trHeight w:val="294"/>
               </w:trPr>
               <w:tc>
                 <w:tcPr>
-                  <w:tcW w:w="2127" w:type="dxa"/>
+                  <w:tcW w:w="2136" w:type="dxa"/>
                   <w:vMerge/>
                 </w:tcPr>
                 <w:p>
@@ -11886,45 +12105,93 @@
               </w:tc>
               <w:tc>
                 <w:tcPr>
-                  <w:tcW w:w="1275" w:type="dxa"/>
+                  <w:tcW w:w="1428" w:type="dxa"/>
                 </w:tcPr>
                 <w:p>
                   <w:pPr>
                     <w:jc w:val="both"/>
                     <w:rPr>
                       <w:color w:val="000000" w:themeColor="text1"/>
-                      <w:sz w:val="22"/>
-                      <w:szCs w:val="22"/>
+                      <w:sz w:val="18"/>
+                      <w:szCs w:val="18"/>
                     </w:rPr>
                   </w:pPr>
                   <w:r>
                     <w:rPr>
                       <w:color w:val="000000" w:themeColor="text1"/>
-                      <w:sz w:val="22"/>
-                      <w:szCs w:val="22"/>
-                    </w:rPr>
-                    <w:t>#5e6a6a</w:t>
+                      <w:sz w:val="18"/>
+                      <w:szCs w:val="18"/>
+                    </w:rPr>
+                    <w:t>(</w:t>
+                  </w:r>
+                  <w:r>
+                    <w:rPr>
+                      <w:color w:val="000000" w:themeColor="text1"/>
+                      <w:sz w:val="18"/>
+                      <w:szCs w:val="18"/>
+                    </w:rPr>
+                    <w:t>209</w:t>
+                  </w:r>
+                  <w:r>
+                    <w:rPr>
+                      <w:color w:val="000000" w:themeColor="text1"/>
+                      <w:sz w:val="18"/>
+                      <w:szCs w:val="18"/>
+                    </w:rPr>
+                    <w:t>, 1</w:t>
+                  </w:r>
+                  <w:r>
+                    <w:rPr>
+                      <w:color w:val="000000" w:themeColor="text1"/>
+                      <w:sz w:val="18"/>
+                      <w:szCs w:val="18"/>
+                    </w:rPr>
+                    <w:t>76</w:t>
+                  </w:r>
+                  <w:r>
+                    <w:rPr>
+                      <w:color w:val="000000" w:themeColor="text1"/>
+                      <w:sz w:val="18"/>
+                      <w:szCs w:val="18"/>
+                    </w:rPr>
+                    <w:t xml:space="preserve">, </w:t>
+                  </w:r>
+                  <w:r>
+                    <w:rPr>
+                      <w:color w:val="000000" w:themeColor="text1"/>
+                      <w:sz w:val="18"/>
+                      <w:szCs w:val="18"/>
+                    </w:rPr>
+                    <w:t>44</w:t>
+                  </w:r>
+                  <w:r>
+                    <w:rPr>
+                      <w:color w:val="000000" w:themeColor="text1"/>
+                      <w:sz w:val="18"/>
+                      <w:szCs w:val="18"/>
+                    </w:rPr>
+                    <w:t>)</w:t>
                   </w:r>
                 </w:p>
               </w:tc>
               <w:tc>
                 <w:tcPr>
-                  <w:tcW w:w="851" w:type="dxa"/>
+                  <w:tcW w:w="631" w:type="dxa"/>
                 </w:tcPr>
                 <w:p>
                   <w:pPr>
                     <w:jc w:val="both"/>
                     <w:rPr>
                       <w:color w:val="000000" w:themeColor="text1"/>
-                      <w:sz w:val="22"/>
-                      <w:szCs w:val="22"/>
+                      <w:sz w:val="18"/>
+                      <w:szCs w:val="18"/>
                     </w:rPr>
                   </w:pPr>
                   <w:r>
                     <w:rPr>
                       <w:color w:val="000000" w:themeColor="text1"/>
-                      <w:sz w:val="22"/>
-                      <w:szCs w:val="22"/>
+                      <w:sz w:val="18"/>
+                      <w:szCs w:val="18"/>
                     </w:rPr>
                     <w:t>18%</w:t>
                   </w:r>
@@ -11932,7 +12199,8 @@
               </w:tc>
               <w:tc>
                 <w:tcPr>
-                  <w:tcW w:w="1984" w:type="dxa"/>
+                  <w:tcW w:w="2106" w:type="dxa"/>
+                  <w:gridSpan w:val="2"/>
                   <w:vMerge/>
                 </w:tcPr>
                 <w:p>
@@ -11948,7 +12216,7 @@
               </w:tc>
               <w:tc>
                 <w:tcPr>
-                  <w:tcW w:w="1223" w:type="dxa"/>
+                  <w:tcW w:w="1516" w:type="dxa"/>
                   <w:vMerge/>
                 </w:tcPr>
                 <w:p>
@@ -11964,7 +12232,7 @@
               </w:tc>
               <w:tc>
                 <w:tcPr>
-                  <w:tcW w:w="1039" w:type="dxa"/>
+                  <w:tcW w:w="668" w:type="dxa"/>
                   <w:vMerge/>
                 </w:tcPr>
                 <w:p>
@@ -11981,11 +12249,13 @@
             </w:tr>
             <w:tr>
               <w:trPr>
+                <w:gridAfter w:val="1"/>
+                <w:wAfter w:w="13" w:type="dxa"/>
                 <w:trHeight w:val="294"/>
               </w:trPr>
               <w:tc>
                 <w:tcPr>
-                  <w:tcW w:w="2127" w:type="dxa"/>
+                  <w:tcW w:w="2136" w:type="dxa"/>
                   <w:vMerge/>
                 </w:tcPr>
                 <w:p>
@@ -12001,45 +12271,45 @@
               </w:tc>
               <w:tc>
                 <w:tcPr>
-                  <w:tcW w:w="1275" w:type="dxa"/>
+                  <w:tcW w:w="1428" w:type="dxa"/>
                 </w:tcPr>
                 <w:p>
                   <w:pPr>
                     <w:jc w:val="both"/>
                     <w:rPr>
                       <w:color w:val="000000" w:themeColor="text1"/>
-                      <w:sz w:val="22"/>
-                      <w:szCs w:val="22"/>
+                      <w:sz w:val="18"/>
+                      <w:szCs w:val="18"/>
                     </w:rPr>
                   </w:pPr>
                   <w:r>
                     <w:rPr>
                       <w:color w:val="000000" w:themeColor="text1"/>
-                      <w:sz w:val="22"/>
-                      <w:szCs w:val="22"/>
-                    </w:rPr>
-                    <w:t>#57aa02</w:t>
+                      <w:sz w:val="18"/>
+                      <w:szCs w:val="18"/>
+                    </w:rPr>
+                    <w:t>(255, 141, 1)</w:t>
                   </w:r>
                 </w:p>
               </w:tc>
               <w:tc>
                 <w:tcPr>
-                  <w:tcW w:w="851" w:type="dxa"/>
+                  <w:tcW w:w="631" w:type="dxa"/>
                 </w:tcPr>
                 <w:p>
                   <w:pPr>
                     <w:jc w:val="both"/>
                     <w:rPr>
                       <w:color w:val="000000" w:themeColor="text1"/>
-                      <w:sz w:val="22"/>
-                      <w:szCs w:val="22"/>
+                      <w:sz w:val="18"/>
+                      <w:szCs w:val="18"/>
                     </w:rPr>
                   </w:pPr>
                   <w:r>
                     <w:rPr>
                       <w:color w:val="000000" w:themeColor="text1"/>
-                      <w:sz w:val="22"/>
-                      <w:szCs w:val="22"/>
+                      <w:sz w:val="18"/>
+                      <w:szCs w:val="18"/>
                     </w:rPr>
                     <w:t>18%</w:t>
                   </w:r>
@@ -12047,7 +12317,8 @@
               </w:tc>
               <w:tc>
                 <w:tcPr>
-                  <w:tcW w:w="1984" w:type="dxa"/>
+                  <w:tcW w:w="2106" w:type="dxa"/>
+                  <w:gridSpan w:val="2"/>
                   <w:vMerge/>
                 </w:tcPr>
                 <w:p>
@@ -12063,7 +12334,8 @@
               </w:tc>
               <w:tc>
                 <w:tcPr>
-                  <w:tcW w:w="1223" w:type="dxa"/>
+                  <w:tcW w:w="1516" w:type="dxa"/>
+                  <w:vMerge/>
                 </w:tcPr>
                 <w:p>
                   <w:pPr>
@@ -12074,19 +12346,12 @@
                       <w:szCs w:val="22"/>
                     </w:rPr>
                   </w:pPr>
-                  <w:r>
-                    <w:rPr>
-                      <w:color w:val="000000" w:themeColor="text1"/>
-                      <w:sz w:val="22"/>
-                      <w:szCs w:val="22"/>
-                    </w:rPr>
-                    <w:t>#09107c</w:t>
-                  </w:r>
                 </w:p>
               </w:tc>
               <w:tc>
                 <w:tcPr>
-                  <w:tcW w:w="1039" w:type="dxa"/>
+                  <w:tcW w:w="668" w:type="dxa"/>
+                  <w:vMerge/>
                 </w:tcPr>
                 <w:p>
                   <w:pPr>
@@ -12097,14 +12362,6 @@
                       <w:szCs w:val="22"/>
                     </w:rPr>
                   </w:pPr>
-                  <w:r>
-                    <w:rPr>
-                      <w:color w:val="000000" w:themeColor="text1"/>
-                      <w:sz w:val="22"/>
-                      <w:szCs w:val="22"/>
-                    </w:rPr>
-                    <w:t>10%</w:t>
-                  </w:r>
                 </w:p>
               </w:tc>
             </w:tr>

</xml_diff>